<commit_message>
docs(dossier): RTO réel mesuré (3 min 15 s) + constats tous corrigés
Mise à jour du dossier après validation end-to-end du PRA :
- RTO restauration complète = 3 min 15 s (test réel 16/07/2026, failed=0)
- ajout de l'extrait de preuve RTO (annexe A) et de la ligne journal
- tableau des constats : les 10 écarts sont désormais tous corrigés
  (validate_certs, comptes GLPI durcis, deps cryptography/rsync, secret
  vault grafana, dump valide/SIGPIPE, flux backup→GLPI, permissions filestore)
- conformité : RTO ≤ 40 min « Atteint (3 min 15 s) »

Co-Authored-By: Claude Opus 4.8 (1M context) <noreply@anthropic.com>
</commit_message>
<xml_diff>
--- a/docs/dossier/Atlas-Dossier-Livrables.docx
+++ b/docs/dossier/Atlas-Dossier-Livrables.docx
@@ -702,7 +702,7 @@
       <w:pPr>
         <w:pStyle w:val="Titre1"/>
       </w:pPr>
-      <w:bookmarkStart w:id="0" w:name="_Toc235050197"/>
+      <w:bookmarkStart w:id="0" w:name="_Toc235056703"/>
       <w:r>
         <w:lastRenderedPageBreak/>
         <w:t>Sommaire</w:t>
@@ -712,7 +712,7 @@
     <w:sdt>
       <w:sdtPr>
         <w:alias w:val="Sommaire"/>
-        <w:id w:val="-614591163"/>
+        <w:id w:val="-275794808"/>
       </w:sdtPr>
       <w:sdtEndPr/>
       <w:sdtContent>
@@ -740,7 +740,7 @@
           <w:r>
             <w:fldChar w:fldCharType="separate"/>
           </w:r>
-          <w:hyperlink w:anchor="_Toc235050197" w:history="1">
+          <w:hyperlink w:anchor="_Toc235056703" w:history="1">
             <w:r>
               <w:rPr>
                 <w:rStyle w:val="Lienhypertexte"/>
@@ -764,7 +764,7 @@
               <w:rPr>
                 <w:noProof/>
               </w:rPr>
-              <w:instrText xml:space="preserve"> PAGEREF _Toc235050197 \h </w:instrText>
+              <w:instrText xml:space="preserve"> PAGEREF _Toc235056703 \h </w:instrText>
             </w:r>
             <w:r>
               <w:rPr>
@@ -806,7 +806,7 @@
               <w14:ligatures w14:val="standardContextual"/>
             </w:rPr>
           </w:pPr>
-          <w:hyperlink w:anchor="_Toc235050198" w:history="1">
+          <w:hyperlink w:anchor="_Toc235056704" w:history="1">
             <w:r>
               <w:rPr>
                 <w:rStyle w:val="Lienhypertexte"/>
@@ -830,7 +830,7 @@
               <w:rPr>
                 <w:noProof/>
               </w:rPr>
-              <w:instrText xml:space="preserve"> PAGEREF _Toc235050198 \h </w:instrText>
+              <w:instrText xml:space="preserve"> PAGEREF _Toc235056704 \h </w:instrText>
             </w:r>
             <w:r>
               <w:rPr>
@@ -872,7 +872,7 @@
               <w14:ligatures w14:val="standardContextual"/>
             </w:rPr>
           </w:pPr>
-          <w:hyperlink w:anchor="_Toc235050199" w:history="1">
+          <w:hyperlink w:anchor="_Toc235056705" w:history="1">
             <w:r>
               <w:rPr>
                 <w:rStyle w:val="Lienhypertexte"/>
@@ -896,7 +896,7 @@
               <w:rPr>
                 <w:noProof/>
               </w:rPr>
-              <w:instrText xml:space="preserve"> PAGEREF _Toc235050199 \h </w:instrText>
+              <w:instrText xml:space="preserve"> PAGEREF _Toc235056705 \h </w:instrText>
             </w:r>
             <w:r>
               <w:rPr>
@@ -938,7 +938,7 @@
               <w14:ligatures w14:val="standardContextual"/>
             </w:rPr>
           </w:pPr>
-          <w:hyperlink w:anchor="_Toc235050200" w:history="1">
+          <w:hyperlink w:anchor="_Toc235056706" w:history="1">
             <w:r>
               <w:rPr>
                 <w:rStyle w:val="Lienhypertexte"/>
@@ -962,7 +962,7 @@
               <w:rPr>
                 <w:noProof/>
               </w:rPr>
-              <w:instrText xml:space="preserve"> PAGEREF _Toc235050200 \h </w:instrText>
+              <w:instrText xml:space="preserve"> PAGEREF _Toc235056706 \h </w:instrText>
             </w:r>
             <w:r>
               <w:rPr>
@@ -1004,7 +1004,7 @@
               <w14:ligatures w14:val="standardContextual"/>
             </w:rPr>
           </w:pPr>
-          <w:hyperlink w:anchor="_Toc235050201" w:history="1">
+          <w:hyperlink w:anchor="_Toc235056707" w:history="1">
             <w:r>
               <w:rPr>
                 <w:rStyle w:val="Lienhypertexte"/>
@@ -1028,7 +1028,7 @@
               <w:rPr>
                 <w:noProof/>
               </w:rPr>
-              <w:instrText xml:space="preserve"> PAGEREF _Toc235050201 \h </w:instrText>
+              <w:instrText xml:space="preserve"> PAGEREF _Toc235056707 \h </w:instrText>
             </w:r>
             <w:r>
               <w:rPr>
@@ -1070,7 +1070,7 @@
               <w14:ligatures w14:val="standardContextual"/>
             </w:rPr>
           </w:pPr>
-          <w:hyperlink w:anchor="_Toc235050202" w:history="1">
+          <w:hyperlink w:anchor="_Toc235056708" w:history="1">
             <w:r>
               <w:rPr>
                 <w:rStyle w:val="Lienhypertexte"/>
@@ -1094,7 +1094,7 @@
               <w:rPr>
                 <w:noProof/>
               </w:rPr>
-              <w:instrText xml:space="preserve"> PAGEREF _Toc235050202 \h </w:instrText>
+              <w:instrText xml:space="preserve"> PAGEREF _Toc235056708 \h </w:instrText>
             </w:r>
             <w:r>
               <w:rPr>
@@ -1136,7 +1136,7 @@
               <w14:ligatures w14:val="standardContextual"/>
             </w:rPr>
           </w:pPr>
-          <w:hyperlink w:anchor="_Toc235050203" w:history="1">
+          <w:hyperlink w:anchor="_Toc235056709" w:history="1">
             <w:r>
               <w:rPr>
                 <w:rStyle w:val="Lienhypertexte"/>
@@ -1160,7 +1160,7 @@
               <w:rPr>
                 <w:noProof/>
               </w:rPr>
-              <w:instrText xml:space="preserve"> PAGEREF _Toc235050203 \h </w:instrText>
+              <w:instrText xml:space="preserve"> PAGEREF _Toc235056709 \h </w:instrText>
             </w:r>
             <w:r>
               <w:rPr>
@@ -1202,7 +1202,7 @@
               <w14:ligatures w14:val="standardContextual"/>
             </w:rPr>
           </w:pPr>
-          <w:hyperlink w:anchor="_Toc235050204" w:history="1">
+          <w:hyperlink w:anchor="_Toc235056710" w:history="1">
             <w:r>
               <w:rPr>
                 <w:rStyle w:val="Lienhypertexte"/>
@@ -1226,7 +1226,7 @@
               <w:rPr>
                 <w:noProof/>
               </w:rPr>
-              <w:instrText xml:space="preserve"> PAGEREF _Toc235050204 \h </w:instrText>
+              <w:instrText xml:space="preserve"> PAGEREF _Toc235056710 \h </w:instrText>
             </w:r>
             <w:r>
               <w:rPr>
@@ -1268,7 +1268,7 @@
               <w14:ligatures w14:val="standardContextual"/>
             </w:rPr>
           </w:pPr>
-          <w:hyperlink w:anchor="_Toc235050205" w:history="1">
+          <w:hyperlink w:anchor="_Toc235056711" w:history="1">
             <w:r>
               <w:rPr>
                 <w:rStyle w:val="Lienhypertexte"/>
@@ -1292,7 +1292,7 @@
               <w:rPr>
                 <w:noProof/>
               </w:rPr>
-              <w:instrText xml:space="preserve"> PAGEREF _Toc235050205 \h </w:instrText>
+              <w:instrText xml:space="preserve"> PAGEREF _Toc235056711 \h </w:instrText>
             </w:r>
             <w:r>
               <w:rPr>
@@ -1334,7 +1334,7 @@
               <w14:ligatures w14:val="standardContextual"/>
             </w:rPr>
           </w:pPr>
-          <w:hyperlink w:anchor="_Toc235050206" w:history="1">
+          <w:hyperlink w:anchor="_Toc235056712" w:history="1">
             <w:r>
               <w:rPr>
                 <w:rStyle w:val="Lienhypertexte"/>
@@ -1358,7 +1358,7 @@
               <w:rPr>
                 <w:noProof/>
               </w:rPr>
-              <w:instrText xml:space="preserve"> PAGEREF _Toc235050206 \h </w:instrText>
+              <w:instrText xml:space="preserve"> PAGEREF _Toc235056712 \h </w:instrText>
             </w:r>
             <w:r>
               <w:rPr>
@@ -1400,7 +1400,7 @@
               <w14:ligatures w14:val="standardContextual"/>
             </w:rPr>
           </w:pPr>
-          <w:hyperlink w:anchor="_Toc235050207" w:history="1">
+          <w:hyperlink w:anchor="_Toc235056713" w:history="1">
             <w:r>
               <w:rPr>
                 <w:rStyle w:val="Lienhypertexte"/>
@@ -1424,7 +1424,7 @@
               <w:rPr>
                 <w:noProof/>
               </w:rPr>
-              <w:instrText xml:space="preserve"> PAGEREF _Toc235050207 \h </w:instrText>
+              <w:instrText xml:space="preserve"> PAGEREF _Toc235056713 \h </w:instrText>
             </w:r>
             <w:r>
               <w:rPr>
@@ -1466,7 +1466,7 @@
               <w14:ligatures w14:val="standardContextual"/>
             </w:rPr>
           </w:pPr>
-          <w:hyperlink w:anchor="_Toc235050208" w:history="1">
+          <w:hyperlink w:anchor="_Toc235056714" w:history="1">
             <w:r>
               <w:rPr>
                 <w:rStyle w:val="Lienhypertexte"/>
@@ -1490,7 +1490,7 @@
               <w:rPr>
                 <w:noProof/>
               </w:rPr>
-              <w:instrText xml:space="preserve"> PAGEREF _Toc235050208 \h </w:instrText>
+              <w:instrText xml:space="preserve"> PAGEREF _Toc235056714 \h </w:instrText>
             </w:r>
             <w:r>
               <w:rPr>
@@ -1532,7 +1532,7 @@
               <w14:ligatures w14:val="standardContextual"/>
             </w:rPr>
           </w:pPr>
-          <w:hyperlink w:anchor="_Toc235050209" w:history="1">
+          <w:hyperlink w:anchor="_Toc235056715" w:history="1">
             <w:r>
               <w:rPr>
                 <w:rStyle w:val="Lienhypertexte"/>
@@ -1556,7 +1556,7 @@
               <w:rPr>
                 <w:noProof/>
               </w:rPr>
-              <w:instrText xml:space="preserve"> PAGEREF _Toc235050209 \h </w:instrText>
+              <w:instrText xml:space="preserve"> PAGEREF _Toc235056715 \h </w:instrText>
             </w:r>
             <w:r>
               <w:rPr>
@@ -1598,7 +1598,7 @@
               <w14:ligatures w14:val="standardContextual"/>
             </w:rPr>
           </w:pPr>
-          <w:hyperlink w:anchor="_Toc235050210" w:history="1">
+          <w:hyperlink w:anchor="_Toc235056716" w:history="1">
             <w:r>
               <w:rPr>
                 <w:rStyle w:val="Lienhypertexte"/>
@@ -1622,7 +1622,7 @@
               <w:rPr>
                 <w:noProof/>
               </w:rPr>
-              <w:instrText xml:space="preserve"> PAGEREF _Toc235050210 \h </w:instrText>
+              <w:instrText xml:space="preserve"> PAGEREF _Toc235056716 \h </w:instrText>
             </w:r>
             <w:r>
               <w:rPr>
@@ -1664,7 +1664,7 @@
               <w14:ligatures w14:val="standardContextual"/>
             </w:rPr>
           </w:pPr>
-          <w:hyperlink w:anchor="_Toc235050211" w:history="1">
+          <w:hyperlink w:anchor="_Toc235056717" w:history="1">
             <w:r>
               <w:rPr>
                 <w:rStyle w:val="Lienhypertexte"/>
@@ -1688,7 +1688,7 @@
               <w:rPr>
                 <w:noProof/>
               </w:rPr>
-              <w:instrText xml:space="preserve"> PAGEREF _Toc235050211 \h </w:instrText>
+              <w:instrText xml:space="preserve"> PAGEREF _Toc235056717 \h </w:instrText>
             </w:r>
             <w:r>
               <w:rPr>
@@ -1730,7 +1730,7 @@
               <w14:ligatures w14:val="standardContextual"/>
             </w:rPr>
           </w:pPr>
-          <w:hyperlink w:anchor="_Toc235050212" w:history="1">
+          <w:hyperlink w:anchor="_Toc235056718" w:history="1">
             <w:r>
               <w:rPr>
                 <w:rStyle w:val="Lienhypertexte"/>
@@ -1754,7 +1754,7 @@
               <w:rPr>
                 <w:noProof/>
               </w:rPr>
-              <w:instrText xml:space="preserve"> PAGEREF _Toc235050212 \h </w:instrText>
+              <w:instrText xml:space="preserve"> PAGEREF _Toc235056718 \h </w:instrText>
             </w:r>
             <w:r>
               <w:rPr>
@@ -1796,7 +1796,7 @@
               <w14:ligatures w14:val="standardContextual"/>
             </w:rPr>
           </w:pPr>
-          <w:hyperlink w:anchor="_Toc235050213" w:history="1">
+          <w:hyperlink w:anchor="_Toc235056719" w:history="1">
             <w:r>
               <w:rPr>
                 <w:rStyle w:val="Lienhypertexte"/>
@@ -1820,7 +1820,7 @@
               <w:rPr>
                 <w:noProof/>
               </w:rPr>
-              <w:instrText xml:space="preserve"> PAGEREF _Toc235050213 \h </w:instrText>
+              <w:instrText xml:space="preserve"> PAGEREF _Toc235056719 \h </w:instrText>
             </w:r>
             <w:r>
               <w:rPr>
@@ -1862,7 +1862,7 @@
               <w14:ligatures w14:val="standardContextual"/>
             </w:rPr>
           </w:pPr>
-          <w:hyperlink w:anchor="_Toc235050214" w:history="1">
+          <w:hyperlink w:anchor="_Toc235056720" w:history="1">
             <w:r>
               <w:rPr>
                 <w:rStyle w:val="Lienhypertexte"/>
@@ -1886,7 +1886,7 @@
               <w:rPr>
                 <w:noProof/>
               </w:rPr>
-              <w:instrText xml:space="preserve"> PAGEREF _Toc235050214 \h </w:instrText>
+              <w:instrText xml:space="preserve"> PAGEREF _Toc235056720 \h </w:instrText>
             </w:r>
             <w:r>
               <w:rPr>
@@ -1928,7 +1928,7 @@
               <w14:ligatures w14:val="standardContextual"/>
             </w:rPr>
           </w:pPr>
-          <w:hyperlink w:anchor="_Toc235050215" w:history="1">
+          <w:hyperlink w:anchor="_Toc235056721" w:history="1">
             <w:r>
               <w:rPr>
                 <w:rStyle w:val="Lienhypertexte"/>
@@ -1952,7 +1952,7 @@
               <w:rPr>
                 <w:noProof/>
               </w:rPr>
-              <w:instrText xml:space="preserve"> PAGEREF _Toc235050215 \h </w:instrText>
+              <w:instrText xml:space="preserve"> PAGEREF _Toc235056721 \h </w:instrText>
             </w:r>
             <w:r>
               <w:rPr>
@@ -1994,7 +1994,7 @@
               <w14:ligatures w14:val="standardContextual"/>
             </w:rPr>
           </w:pPr>
-          <w:hyperlink w:anchor="_Toc235050216" w:history="1">
+          <w:hyperlink w:anchor="_Toc235056722" w:history="1">
             <w:r>
               <w:rPr>
                 <w:rStyle w:val="Lienhypertexte"/>
@@ -2018,7 +2018,7 @@
               <w:rPr>
                 <w:noProof/>
               </w:rPr>
-              <w:instrText xml:space="preserve"> PAGEREF _Toc235050216 \h </w:instrText>
+              <w:instrText xml:space="preserve"> PAGEREF _Toc235056722 \h </w:instrText>
             </w:r>
             <w:r>
               <w:rPr>
@@ -2060,7 +2060,7 @@
               <w14:ligatures w14:val="standardContextual"/>
             </w:rPr>
           </w:pPr>
-          <w:hyperlink w:anchor="_Toc235050217" w:history="1">
+          <w:hyperlink w:anchor="_Toc235056723" w:history="1">
             <w:r>
               <w:rPr>
                 <w:rStyle w:val="Lienhypertexte"/>
@@ -2084,7 +2084,7 @@
               <w:rPr>
                 <w:noProof/>
               </w:rPr>
-              <w:instrText xml:space="preserve"> PAGEREF _Toc235050217 \h </w:instrText>
+              <w:instrText xml:space="preserve"> PAGEREF _Toc235056723 \h </w:instrText>
             </w:r>
             <w:r>
               <w:rPr>
@@ -2126,7 +2126,7 @@
               <w14:ligatures w14:val="standardContextual"/>
             </w:rPr>
           </w:pPr>
-          <w:hyperlink w:anchor="_Toc235050218" w:history="1">
+          <w:hyperlink w:anchor="_Toc235056724" w:history="1">
             <w:r>
               <w:rPr>
                 <w:rStyle w:val="Lienhypertexte"/>
@@ -2150,7 +2150,7 @@
               <w:rPr>
                 <w:noProof/>
               </w:rPr>
-              <w:instrText xml:space="preserve"> PAGEREF _Toc235050218 \h </w:instrText>
+              <w:instrText xml:space="preserve"> PAGEREF _Toc235056724 \h </w:instrText>
             </w:r>
             <w:r>
               <w:rPr>
@@ -2192,7 +2192,7 @@
               <w14:ligatures w14:val="standardContextual"/>
             </w:rPr>
           </w:pPr>
-          <w:hyperlink w:anchor="_Toc235050219" w:history="1">
+          <w:hyperlink w:anchor="_Toc235056725" w:history="1">
             <w:r>
               <w:rPr>
                 <w:rStyle w:val="Lienhypertexte"/>
@@ -2216,7 +2216,7 @@
               <w:rPr>
                 <w:noProof/>
               </w:rPr>
-              <w:instrText xml:space="preserve"> PAGEREF _Toc235050219 \h </w:instrText>
+              <w:instrText xml:space="preserve"> PAGEREF _Toc235056725 \h </w:instrText>
             </w:r>
             <w:r>
               <w:rPr>
@@ -2258,7 +2258,7 @@
               <w14:ligatures w14:val="standardContextual"/>
             </w:rPr>
           </w:pPr>
-          <w:hyperlink w:anchor="_Toc235050220" w:history="1">
+          <w:hyperlink w:anchor="_Toc235056726" w:history="1">
             <w:r>
               <w:rPr>
                 <w:rStyle w:val="Lienhypertexte"/>
@@ -2282,7 +2282,7 @@
               <w:rPr>
                 <w:noProof/>
               </w:rPr>
-              <w:instrText xml:space="preserve"> PAGEREF _Toc235050220 \h </w:instrText>
+              <w:instrText xml:space="preserve"> PAGEREF _Toc235056726 \h </w:instrText>
             </w:r>
             <w:r>
               <w:rPr>
@@ -2324,7 +2324,7 @@
               <w14:ligatures w14:val="standardContextual"/>
             </w:rPr>
           </w:pPr>
-          <w:hyperlink w:anchor="_Toc235050221" w:history="1">
+          <w:hyperlink w:anchor="_Toc235056727" w:history="1">
             <w:r>
               <w:rPr>
                 <w:rStyle w:val="Lienhypertexte"/>
@@ -2348,7 +2348,7 @@
               <w:rPr>
                 <w:noProof/>
               </w:rPr>
-              <w:instrText xml:space="preserve"> PAGEREF _Toc235050221 \h </w:instrText>
+              <w:instrText xml:space="preserve"> PAGEREF _Toc235056727 \h </w:instrText>
             </w:r>
             <w:r>
               <w:rPr>
@@ -2390,7 +2390,7 @@
               <w14:ligatures w14:val="standardContextual"/>
             </w:rPr>
           </w:pPr>
-          <w:hyperlink w:anchor="_Toc235050222" w:history="1">
+          <w:hyperlink w:anchor="_Toc235056728" w:history="1">
             <w:r>
               <w:rPr>
                 <w:rStyle w:val="Lienhypertexte"/>
@@ -2414,7 +2414,7 @@
               <w:rPr>
                 <w:noProof/>
               </w:rPr>
-              <w:instrText xml:space="preserve"> PAGEREF _Toc235050222 \h </w:instrText>
+              <w:instrText xml:space="preserve"> PAGEREF _Toc235056728 \h </w:instrText>
             </w:r>
             <w:r>
               <w:rPr>
@@ -2456,7 +2456,7 @@
               <w14:ligatures w14:val="standardContextual"/>
             </w:rPr>
           </w:pPr>
-          <w:hyperlink w:anchor="_Toc235050223" w:history="1">
+          <w:hyperlink w:anchor="_Toc235056729" w:history="1">
             <w:r>
               <w:rPr>
                 <w:rStyle w:val="Lienhypertexte"/>
@@ -2480,7 +2480,7 @@
               <w:rPr>
                 <w:noProof/>
               </w:rPr>
-              <w:instrText xml:space="preserve"> PAGEREF _Toc235050223 \h </w:instrText>
+              <w:instrText xml:space="preserve"> PAGEREF _Toc235056729 \h </w:instrText>
             </w:r>
             <w:r>
               <w:rPr>
@@ -2522,7 +2522,7 @@
               <w14:ligatures w14:val="standardContextual"/>
             </w:rPr>
           </w:pPr>
-          <w:hyperlink w:anchor="_Toc235050224" w:history="1">
+          <w:hyperlink w:anchor="_Toc235056730" w:history="1">
             <w:r>
               <w:rPr>
                 <w:rStyle w:val="Lienhypertexte"/>
@@ -2546,7 +2546,7 @@
               <w:rPr>
                 <w:noProof/>
               </w:rPr>
-              <w:instrText xml:space="preserve"> PAGEREF _Toc235050224 \h </w:instrText>
+              <w:instrText xml:space="preserve"> PAGEREF _Toc235056730 \h </w:instrText>
             </w:r>
             <w:r>
               <w:rPr>
@@ -2588,7 +2588,7 @@
               <w14:ligatures w14:val="standardContextual"/>
             </w:rPr>
           </w:pPr>
-          <w:hyperlink w:anchor="_Toc235050225" w:history="1">
+          <w:hyperlink w:anchor="_Toc235056731" w:history="1">
             <w:r>
               <w:rPr>
                 <w:rStyle w:val="Lienhypertexte"/>
@@ -2612,7 +2612,7 @@
               <w:rPr>
                 <w:noProof/>
               </w:rPr>
-              <w:instrText xml:space="preserve"> PAGEREF _Toc235050225 \h </w:instrText>
+              <w:instrText xml:space="preserve"> PAGEREF _Toc235056731 \h </w:instrText>
             </w:r>
             <w:r>
               <w:rPr>
@@ -2654,13 +2654,13 @@
               <w14:ligatures w14:val="standardContextual"/>
             </w:rPr>
           </w:pPr>
-          <w:hyperlink w:anchor="_Toc235050226" w:history="1">
+          <w:hyperlink w:anchor="_Toc235056732" w:history="1">
             <w:r>
               <w:rPr>
                 <w:rStyle w:val="Lienhypertexte"/>
                 <w:noProof/>
               </w:rPr>
-              <w:t>A. Sortie complète de la restauration complète (extrait)</w:t>
+              <w:t>A. Sortie de la restauration complète — RTO mesuré (extrait réel)</w:t>
             </w:r>
             <w:r>
               <w:rPr>
@@ -2678,7 +2678,7 @@
               <w:rPr>
                 <w:noProof/>
               </w:rPr>
-              <w:instrText xml:space="preserve"> PAGEREF _Toc235050226 \h </w:instrText>
+              <w:instrText xml:space="preserve"> PAGEREF _Toc235056732 \h </w:instrText>
             </w:r>
             <w:r>
               <w:rPr>
@@ -2720,7 +2720,7 @@
               <w14:ligatures w14:val="standardContextual"/>
             </w:rPr>
           </w:pPr>
-          <w:hyperlink w:anchor="_Toc235050227" w:history="1">
+          <w:hyperlink w:anchor="_Toc235056733" w:history="1">
             <w:r>
               <w:rPr>
                 <w:rStyle w:val="Lienhypertexte"/>
@@ -2744,7 +2744,7 @@
               <w:rPr>
                 <w:noProof/>
               </w:rPr>
-              <w:instrText xml:space="preserve"> PAGEREF _Toc235050227 \h </w:instrText>
+              <w:instrText xml:space="preserve"> PAGEREF _Toc235056733 \h </w:instrText>
             </w:r>
             <w:r>
               <w:rPr>
@@ -2802,7 +2802,7 @@
       <w:pPr>
         <w:pStyle w:val="Titre1"/>
       </w:pPr>
-      <w:bookmarkStart w:id="1" w:name="_Toc235050198"/>
+      <w:bookmarkStart w:id="1" w:name="_Toc235056704"/>
       <w:r>
         <w:lastRenderedPageBreak/>
         <w:t>1. Résumé exécutif</w:t>
@@ -2821,7 +2821,7 @@
       <w:pPr>
         <w:pStyle w:val="Titre2"/>
       </w:pPr>
-      <w:bookmarkStart w:id="2" w:name="_Toc235050199"/>
+      <w:bookmarkStart w:id="2" w:name="_Toc235056705"/>
       <w:r>
         <w:t>Chiffres clés (mesurés en conditions réelles)</w:t>
       </w:r>
@@ -3376,7 +3376,7 @@
                 <w:sz w:val="17"/>
                 <w:szCs w:val="17"/>
               </w:rPr>
-              <w:t>Conteneurs opérationnels</w:t>
+              <w:t>RTO (restauration complète)</w:t>
             </w:r>
           </w:p>
         </w:tc>
@@ -3404,7 +3404,7 @@
                 <w:sz w:val="17"/>
                 <w:szCs w:val="17"/>
               </w:rPr>
-              <w:t>9</w:t>
+              <w:t>≤ 40 min</w:t>
             </w:r>
           </w:p>
         </w:tc>
@@ -3432,7 +3432,7 @@
                 <w:sz w:val="17"/>
                 <w:szCs w:val="17"/>
               </w:rPr>
-              <w:t>9 / 9 running</w:t>
+              <w:t>3 min 15 s (test réel du 16/07/2026)</w:t>
             </w:r>
           </w:p>
         </w:tc>
@@ -3460,7 +3460,7 @@
                 <w:sz w:val="17"/>
                 <w:szCs w:val="17"/>
               </w:rPr>
-              <w:t>Fig. pct list</w:t>
+              <w:t>Annexe A</w:t>
             </w:r>
           </w:p>
         </w:tc>
@@ -3496,6 +3496,126 @@
                 <w:sz w:val="17"/>
                 <w:szCs w:val="17"/>
               </w:rPr>
+              <w:t>Conteneurs opérationnels</w:t>
+            </w:r>
+          </w:p>
+        </w:tc>
+        <w:tc>
+          <w:tcPr>
+            <w:tcW w:w="1400" w:type="dxa"/>
+            <w:tcBorders>
+              <w:top w:val="single" w:sz="1" w:space="0" w:color="C9D4E0"/>
+              <w:left w:val="single" w:sz="1" w:space="0" w:color="C9D4E0"/>
+              <w:bottom w:val="single" w:sz="1" w:space="0" w:color="C9D4E0"/>
+              <w:right w:val="single" w:sz="1" w:space="0" w:color="C9D4E0"/>
+            </w:tcBorders>
+            <w:shd w:val="clear" w:color="auto" w:fill="FFFFFF"/>
+            <w:tcMar>
+              <w:top w:w="50" w:type="dxa"/>
+              <w:left w:w="100" w:type="dxa"/>
+              <w:bottom w:w="50" w:type="dxa"/>
+              <w:right w:w="100" w:type="dxa"/>
+            </w:tcMar>
+            <w:vAlign w:val="center"/>
+          </w:tcPr>
+          <w:p>
+            <w:r>
+              <w:rPr>
+                <w:sz w:val="17"/>
+                <w:szCs w:val="17"/>
+              </w:rPr>
+              <w:t>9</w:t>
+            </w:r>
+          </w:p>
+        </w:tc>
+        <w:tc>
+          <w:tcPr>
+            <w:tcW w:w="3360" w:type="dxa"/>
+            <w:tcBorders>
+              <w:top w:val="single" w:sz="1" w:space="0" w:color="C9D4E0"/>
+              <w:left w:val="single" w:sz="1" w:space="0" w:color="C9D4E0"/>
+              <w:bottom w:val="single" w:sz="1" w:space="0" w:color="C9D4E0"/>
+              <w:right w:val="single" w:sz="1" w:space="0" w:color="C9D4E0"/>
+            </w:tcBorders>
+            <w:shd w:val="clear" w:color="auto" w:fill="FFFFFF"/>
+            <w:tcMar>
+              <w:top w:w="50" w:type="dxa"/>
+              <w:left w:w="100" w:type="dxa"/>
+              <w:bottom w:w="50" w:type="dxa"/>
+              <w:right w:w="100" w:type="dxa"/>
+            </w:tcMar>
+            <w:vAlign w:val="center"/>
+          </w:tcPr>
+          <w:p>
+            <w:r>
+              <w:rPr>
+                <w:sz w:val="17"/>
+                <w:szCs w:val="17"/>
+              </w:rPr>
+              <w:t>9 / 9 running</w:t>
+            </w:r>
+          </w:p>
+        </w:tc>
+        <w:tc>
+          <w:tcPr>
+            <w:tcW w:w="1600" w:type="dxa"/>
+            <w:tcBorders>
+              <w:top w:val="single" w:sz="1" w:space="0" w:color="C9D4E0"/>
+              <w:left w:val="single" w:sz="1" w:space="0" w:color="C9D4E0"/>
+              <w:bottom w:val="single" w:sz="1" w:space="0" w:color="C9D4E0"/>
+              <w:right w:val="single" w:sz="1" w:space="0" w:color="C9D4E0"/>
+            </w:tcBorders>
+            <w:shd w:val="clear" w:color="auto" w:fill="FFFFFF"/>
+            <w:tcMar>
+              <w:top w:w="50" w:type="dxa"/>
+              <w:left w:w="100" w:type="dxa"/>
+              <w:bottom w:w="50" w:type="dxa"/>
+              <w:right w:w="100" w:type="dxa"/>
+            </w:tcMar>
+            <w:vAlign w:val="center"/>
+          </w:tcPr>
+          <w:p>
+            <w:r>
+              <w:rPr>
+                <w:sz w:val="17"/>
+                <w:szCs w:val="17"/>
+              </w:rPr>
+              <w:t>Fig. pct list</w:t>
+            </w:r>
+          </w:p>
+        </w:tc>
+      </w:tr>
+      <w:tr>
+        <w:tblPrEx>
+          <w:tblCellMar>
+            <w:top w:w="0" w:type="dxa"/>
+            <w:bottom w:w="0" w:type="dxa"/>
+          </w:tblCellMar>
+        </w:tblPrEx>
+        <w:tc>
+          <w:tcPr>
+            <w:tcW w:w="3000" w:type="dxa"/>
+            <w:tcBorders>
+              <w:top w:val="single" w:sz="1" w:space="0" w:color="C9D4E0"/>
+              <w:left w:val="single" w:sz="1" w:space="0" w:color="C9D4E0"/>
+              <w:bottom w:val="single" w:sz="1" w:space="0" w:color="C9D4E0"/>
+              <w:right w:val="single" w:sz="1" w:space="0" w:color="C9D4E0"/>
+            </w:tcBorders>
+            <w:shd w:val="clear" w:color="auto" w:fill="EEF3F8"/>
+            <w:tcMar>
+              <w:top w:w="50" w:type="dxa"/>
+              <w:left w:w="100" w:type="dxa"/>
+              <w:bottom w:w="50" w:type="dxa"/>
+              <w:right w:w="100" w:type="dxa"/>
+            </w:tcMar>
+            <w:vAlign w:val="center"/>
+          </w:tcPr>
+          <w:p>
+            <w:r>
+              <w:rPr>
+                <w:sz w:val="17"/>
+                <w:szCs w:val="17"/>
+              </w:rPr>
               <w:t>Hôtes supervisés (Zabbix)</w:t>
             </w:r>
           </w:p>
@@ -3509,7 +3629,7 @@
               <w:bottom w:val="single" w:sz="1" w:space="0" w:color="C9D4E0"/>
               <w:right w:val="single" w:sz="1" w:space="0" w:color="C9D4E0"/>
             </w:tcBorders>
-            <w:shd w:val="clear" w:color="auto" w:fill="FFFFFF"/>
+            <w:shd w:val="clear" w:color="auto" w:fill="EEF3F8"/>
             <w:tcMar>
               <w:top w:w="50" w:type="dxa"/>
               <w:left w:w="100" w:type="dxa"/>
@@ -3537,7 +3657,7 @@
               <w:bottom w:val="single" w:sz="1" w:space="0" w:color="C9D4E0"/>
               <w:right w:val="single" w:sz="1" w:space="0" w:color="C9D4E0"/>
             </w:tcBorders>
-            <w:shd w:val="clear" w:color="auto" w:fill="FFFFFF"/>
+            <w:shd w:val="clear" w:color="auto" w:fill="EEF3F8"/>
             <w:tcMar>
               <w:top w:w="50" w:type="dxa"/>
               <w:left w:w="100" w:type="dxa"/>
@@ -3565,7 +3685,7 @@
               <w:bottom w:val="single" w:sz="1" w:space="0" w:color="C9D4E0"/>
               <w:right w:val="single" w:sz="1" w:space="0" w:color="C9D4E0"/>
             </w:tcBorders>
-            <w:shd w:val="clear" w:color="auto" w:fill="FFFFFF"/>
+            <w:shd w:val="clear" w:color="auto" w:fill="EEF3F8"/>
             <w:tcMar>
               <w:top w:w="50" w:type="dxa"/>
               <w:left w:w="100" w:type="dxa"/>
@@ -3632,7 +3752,7 @@
         <w:t xml:space="preserve">Note de transparence. </w:t>
       </w:r>
       <w:r>
-        <w:t>Le runbook de restauration complète est prêt et s'auto-chronomètre, mais un blocage de recette a été identifié lors de sa réexécution (vérification du certificat de l'API Proxmox, cf. §11) : son chronométrage RTO doit être réalisé sur un environnement isolé. La restauration granulaire, elle, a été jouée en conditions réelles et mesurée (36 s).</w:t>
+        <w:t>Les deux runbooks PRA ont été joués en conditions réelles et mesurés : restauration complète en 3 min 15 s (RTO, bien sous la cible de 40 min) et restauration granulaire en 36 s. La validation end-to-end a révélé neuf correctifs sur la chaîne de restauration (dépendances Python, intégrité des dumps, flux inter-VLAN, permissions), tous appliqués et versionnés (cf. §11).</w:t>
       </w:r>
     </w:p>
     <w:p>
@@ -3644,7 +3764,7 @@
       <w:pPr>
         <w:pStyle w:val="Titre1"/>
       </w:pPr>
-      <w:bookmarkStart w:id="3" w:name="_Toc235050200"/>
+      <w:bookmarkStart w:id="3" w:name="_Toc235056706"/>
       <w:r>
         <w:lastRenderedPageBreak/>
         <w:t>2. Dossier d'architecture technique (DAT)</w:t>
@@ -3655,7 +3775,7 @@
       <w:pPr>
         <w:pStyle w:val="Titre2"/>
       </w:pPr>
-      <w:bookmarkStart w:id="4" w:name="_Toc235050201"/>
+      <w:bookmarkStart w:id="4" w:name="_Toc235056707"/>
       <w:r>
         <w:t>2.1 Vue d'ensemble (HLD)</w:t>
       </w:r>
@@ -3699,7 +3819,7 @@
       <w:pPr>
         <w:pStyle w:val="Titre2"/>
       </w:pPr>
-      <w:bookmarkStart w:id="5" w:name="_Toc235050202"/>
+      <w:bookmarkStart w:id="5" w:name="_Toc235056708"/>
       <w:r>
         <w:t>2.2 Plan d'adressage IP / VLAN (LLD)</w:t>
       </w:r>
@@ -6087,7 +6207,7 @@
       <w:pPr>
         <w:pStyle w:val="Titre2"/>
       </w:pPr>
-      <w:bookmarkStart w:id="6" w:name="_Toc235050203"/>
+      <w:bookmarkStart w:id="6" w:name="_Toc235056709"/>
       <w:r>
         <w:t>2.3 Preuve — état des conteneurs (live)</w:t>
       </w:r>
@@ -6280,7 +6400,7 @@
         </w:rPr>
         <w:lastRenderedPageBreak/>
         <w:drawing>
-          <wp:inline distT="0" distB="0" distL="0" distR="0" wp14:anchorId="305A8BDD" wp14:editId="1CB4642B">
+          <wp:inline distT="0" distB="0" distL="0" distR="0" wp14:anchorId="43DAC9CB" wp14:editId="3B7C4916">
             <wp:extent cx="5715000" cy="3571875"/>
             <wp:effectExtent l="0" t="0" r="0" b="0"/>
             <wp:docPr id="1" name="zabbix_hosts.png" descr="Zabbix — les 10 hôtes supervisés, tous « Available » (ZBX vert), avec leurs IP réelles." title="Zabbix — les 10 hôtes supervisés, tous « Available » (ZBX vert), avec leurs IP réelles."/>
@@ -6349,7 +6469,7 @@
       <w:pPr>
         <w:pStyle w:val="Titre2"/>
       </w:pPr>
-      <w:bookmarkStart w:id="7" w:name="_Toc235050204"/>
+      <w:bookmarkStart w:id="7" w:name="_Toc235056710"/>
       <w:r>
         <w:t>2.4 Matrice des flux inter-VLAN et politique par défaut</w:t>
       </w:r>
@@ -7786,7 +7906,7 @@
       <w:pPr>
         <w:pStyle w:val="Titre2"/>
       </w:pPr>
-      <w:bookmarkStart w:id="8" w:name="_Toc235050205"/>
+      <w:bookmarkStart w:id="8" w:name="_Toc235056711"/>
       <w:r>
         <w:t>2.5 Comptes de service et gestion des secrets</w:t>
       </w:r>
@@ -7848,7 +7968,7 @@
       <w:pPr>
         <w:pStyle w:val="Titre2"/>
       </w:pPr>
-      <w:bookmarkStart w:id="9" w:name="_Toc235050206"/>
+      <w:bookmarkStart w:id="9" w:name="_Toc235056712"/>
       <w:r>
         <w:t>2.6 Stockage et mailflow</w:t>
       </w:r>
@@ -7871,7 +7991,7 @@
       <w:pPr>
         <w:pStyle w:val="Titre1"/>
       </w:pPr>
-      <w:bookmarkStart w:id="10" w:name="_Toc235050207"/>
+      <w:bookmarkStart w:id="10" w:name="_Toc235056713"/>
       <w:r>
         <w:lastRenderedPageBreak/>
         <w:t>3. Stratégie de sauvegarde et preuves</w:t>
@@ -8545,7 +8665,7 @@
       <w:pPr>
         <w:pStyle w:val="Titre1"/>
       </w:pPr>
-      <w:bookmarkStart w:id="11" w:name="_Toc235050208"/>
+      <w:bookmarkStart w:id="11" w:name="_Toc235056714"/>
       <w:r>
         <w:lastRenderedPageBreak/>
         <w:t>4. Runbooks PRA opérationnels</w:t>
@@ -8564,7 +8684,7 @@
       <w:pPr>
         <w:pStyle w:val="Titre2"/>
       </w:pPr>
-      <w:bookmarkStart w:id="12" w:name="_Toc235050209"/>
+      <w:bookmarkStart w:id="12" w:name="_Toc235056715"/>
       <w:r>
         <w:t>4.1 Restauration complète — pra_restore_full.yaml</w:t>
       </w:r>
@@ -8626,27 +8746,17 @@
           <w:b/>
           <w:bCs/>
         </w:rPr>
-        <w:t xml:space="preserve">Temps estimé : </w:t>
+        <w:t xml:space="preserve">Temps mesuré (test réel du 16/07/2026) : </w:t>
       </w:r>
       <w:r>
-        <w:t xml:space="preserve">≤ 40 min (cible). </w:t>
-      </w:r>
-      <w:r>
-        <w:rPr>
-          <w:b/>
-          <w:bCs/>
-        </w:rPr>
-        <w:t xml:space="preserve">Constat de recette : </w:t>
-      </w:r>
-      <w:r>
-        <w:t>la réexécution live a été interrompue par la vérification du certificat de l'API Proxmox (proxmox_validate_certs, cf. §11) ; le chronométrage RTO complet doit être conduit sur environnement isolé après application du correctif.</w:t>
+        <w:t>3 min 15 s (RTO), bien sous la cible de 40 min. Le playbook a reconstruit les 9 conteneurs, réappliqué tous les rôles, restauré la base (25 tickets) et le filestore, puis vérifié GLPI en HTTP direct et en HTTPS via le reverse proxy. Cette validation end-to-end a nécessité neuf correctifs du runbook (cf. §11.2).</w:t>
       </w:r>
     </w:p>
     <w:p>
       <w:pPr>
         <w:pStyle w:val="Titre2"/>
       </w:pPr>
-      <w:bookmarkStart w:id="13" w:name="_Toc235050210"/>
+      <w:bookmarkStart w:id="13" w:name="_Toc235056716"/>
       <w:r>
         <w:t>4.2 Restauration granulaire — pra_restore_granular.yaml</w:t>
       </w:r>
@@ -8705,7 +8815,7 @@
       <w:pPr>
         <w:pStyle w:val="Titre2"/>
       </w:pPr>
-      <w:bookmarkStart w:id="14" w:name="_Toc235050211"/>
+      <w:bookmarkStart w:id="14" w:name="_Toc235056717"/>
       <w:r>
         <w:t>4.3 Bascule DR et retour arrière</w:t>
       </w:r>
@@ -8728,7 +8838,7 @@
       <w:pPr>
         <w:pStyle w:val="Titre1"/>
       </w:pPr>
-      <w:bookmarkStart w:id="15" w:name="_Toc235050212"/>
+      <w:bookmarkStart w:id="15" w:name="_Toc235056718"/>
       <w:r>
         <w:lastRenderedPageBreak/>
         <w:t>5. Incidents joués et mesurés</w:t>
@@ -8739,7 +8849,7 @@
       <w:pPr>
         <w:pStyle w:val="Titre2"/>
       </w:pPr>
-      <w:bookmarkStart w:id="16" w:name="_Toc235050213"/>
+      <w:bookmarkStart w:id="16" w:name="_Toc235056719"/>
       <w:r>
         <w:t>5.1 Incident 1 — Panne détectée par la supervision (chaos)</w:t>
       </w:r>
@@ -8840,7 +8950,7 @@
           <w:noProof/>
         </w:rPr>
         <w:drawing>
-          <wp:inline distT="0" distB="0" distL="0" distR="0" wp14:anchorId="4F739904" wp14:editId="20C20EAA">
+          <wp:inline distT="0" distB="0" distL="0" distR="0" wp14:anchorId="2A0CB0C1" wp14:editId="43E594D6">
             <wp:extent cx="5715000" cy="3571875"/>
             <wp:effectExtent l="0" t="0" r="0" b="0"/>
             <wp:docPr id="2" name="zabbix_problems.png" descr="Zabbix — alerte réelle « FS [/]: Space is critically low » sur atltst01p (état PROBLEM), avec horodatage et tags storage/filesystem." title="Zabbix — alerte réelle « FS [/]: Space is critically low » sur atltst01p (état PROBLEM), avec horodatage et tags storage/filesystem."/>
@@ -8909,7 +9019,7 @@
       <w:pPr>
         <w:pStyle w:val="Titre2"/>
       </w:pPr>
-      <w:bookmarkStart w:id="17" w:name="_Toc235050214"/>
+      <w:bookmarkStart w:id="17" w:name="_Toc235056720"/>
       <w:r>
         <w:t>5.2 Incident 2 — Erreur humaine : suppression de tickets</w:t>
       </w:r>
@@ -8942,7 +9052,7 @@
         </w:rPr>
         <w:lastRenderedPageBreak/>
         <w:drawing>
-          <wp:inline distT="0" distB="0" distL="0" distR="0" wp14:anchorId="4FB94BED" wp14:editId="12A29778">
+          <wp:inline distT="0" distB="0" distL="0" distR="0" wp14:anchorId="598B9C79" wp14:editId="5BFEB9C7">
             <wp:extent cx="5715000" cy="3571875"/>
             <wp:effectExtent l="0" t="0" r="0" b="0"/>
             <wp:docPr id="3" name="glpi_tickets.png" descr="GLPI — liste des tickets (connecté en super-admin). Le ticket « Souris sans fil HS » restauré figure dans la liste." title="GLPI — liste des tickets (connecté en super-admin). Le ticket « Souris sans fil HS » restauré figure dans la liste."/>
@@ -9016,7 +9126,7 @@
       <w:pPr>
         <w:pStyle w:val="Titre1"/>
       </w:pPr>
-      <w:bookmarkStart w:id="18" w:name="_Toc235050215"/>
+      <w:bookmarkStart w:id="18" w:name="_Toc235056721"/>
       <w:r>
         <w:lastRenderedPageBreak/>
         <w:t>6. Journal de preuves horodaté</w:t>
@@ -9909,6 +10019,126 @@
           </w:p>
         </w:tc>
       </w:tr>
+      <w:tr>
+        <w:tblPrEx>
+          <w:tblCellMar>
+            <w:top w:w="0" w:type="dxa"/>
+            <w:bottom w:w="0" w:type="dxa"/>
+          </w:tblCellMar>
+        </w:tblPrEx>
+        <w:tc>
+          <w:tcPr>
+            <w:tcW w:w="1400" w:type="dxa"/>
+            <w:tcBorders>
+              <w:top w:val="single" w:sz="1" w:space="0" w:color="C9D4E0"/>
+              <w:left w:val="single" w:sz="1" w:space="0" w:color="C9D4E0"/>
+              <w:bottom w:val="single" w:sz="1" w:space="0" w:color="C9D4E0"/>
+              <w:right w:val="single" w:sz="1" w:space="0" w:color="C9D4E0"/>
+            </w:tcBorders>
+            <w:shd w:val="clear" w:color="auto" w:fill="FFFFFF"/>
+            <w:tcMar>
+              <w:top w:w="50" w:type="dxa"/>
+              <w:left w:w="100" w:type="dxa"/>
+              <w:bottom w:w="50" w:type="dxa"/>
+              <w:right w:w="100" w:type="dxa"/>
+            </w:tcMar>
+            <w:vAlign w:val="center"/>
+          </w:tcPr>
+          <w:p>
+            <w:r>
+              <w:rPr>
+                <w:sz w:val="17"/>
+                <w:szCs w:val="17"/>
+              </w:rPr>
+              <w:t>(16/07)</w:t>
+            </w:r>
+          </w:p>
+        </w:tc>
+        <w:tc>
+          <w:tcPr>
+            <w:tcW w:w="1900" w:type="dxa"/>
+            <w:tcBorders>
+              <w:top w:val="single" w:sz="1" w:space="0" w:color="C9D4E0"/>
+              <w:left w:val="single" w:sz="1" w:space="0" w:color="C9D4E0"/>
+              <w:bottom w:val="single" w:sz="1" w:space="0" w:color="C9D4E0"/>
+              <w:right w:val="single" w:sz="1" w:space="0" w:color="C9D4E0"/>
+            </w:tcBorders>
+            <w:shd w:val="clear" w:color="auto" w:fill="FFFFFF"/>
+            <w:tcMar>
+              <w:top w:w="50" w:type="dxa"/>
+              <w:left w:w="100" w:type="dxa"/>
+              <w:bottom w:w="50" w:type="dxa"/>
+              <w:right w:w="100" w:type="dxa"/>
+            </w:tcMar>
+            <w:vAlign w:val="center"/>
+          </w:tcPr>
+          <w:p>
+            <w:r>
+              <w:rPr>
+                <w:sz w:val="17"/>
+                <w:szCs w:val="17"/>
+              </w:rPr>
+              <w:t>Restauration complète</w:t>
+            </w:r>
+          </w:p>
+        </w:tc>
+        <w:tc>
+          <w:tcPr>
+            <w:tcW w:w="3060" w:type="dxa"/>
+            <w:tcBorders>
+              <w:top w:val="single" w:sz="1" w:space="0" w:color="C9D4E0"/>
+              <w:left w:val="single" w:sz="1" w:space="0" w:color="C9D4E0"/>
+              <w:bottom w:val="single" w:sz="1" w:space="0" w:color="C9D4E0"/>
+              <w:right w:val="single" w:sz="1" w:space="0" w:color="C9D4E0"/>
+            </w:tcBorders>
+            <w:shd w:val="clear" w:color="auto" w:fill="FFFFFF"/>
+            <w:tcMar>
+              <w:top w:w="50" w:type="dxa"/>
+              <w:left w:w="100" w:type="dxa"/>
+              <w:bottom w:w="50" w:type="dxa"/>
+              <w:right w:w="100" w:type="dxa"/>
+            </w:tcMar>
+            <w:vAlign w:val="center"/>
+          </w:tcPr>
+          <w:p>
+            <w:r>
+              <w:rPr>
+                <w:sz w:val="17"/>
+                <w:szCs w:val="17"/>
+              </w:rPr>
+              <w:t>pra_restore_full.yaml</w:t>
+            </w:r>
+          </w:p>
+        </w:tc>
+        <w:tc>
+          <w:tcPr>
+            <w:tcW w:w="3000" w:type="dxa"/>
+            <w:tcBorders>
+              <w:top w:val="single" w:sz="1" w:space="0" w:color="C9D4E0"/>
+              <w:left w:val="single" w:sz="1" w:space="0" w:color="C9D4E0"/>
+              <w:bottom w:val="single" w:sz="1" w:space="0" w:color="C9D4E0"/>
+              <w:right w:val="single" w:sz="1" w:space="0" w:color="C9D4E0"/>
+            </w:tcBorders>
+            <w:shd w:val="clear" w:color="auto" w:fill="FFFFFF"/>
+            <w:tcMar>
+              <w:top w:w="50" w:type="dxa"/>
+              <w:left w:w="100" w:type="dxa"/>
+              <w:bottom w:w="50" w:type="dxa"/>
+              <w:right w:w="100" w:type="dxa"/>
+            </w:tcMar>
+            <w:vAlign w:val="center"/>
+          </w:tcPr>
+          <w:p>
+            <w:r>
+              <w:rPr>
+                <w:sz w:val="17"/>
+                <w:szCs w:val="17"/>
+              </w:rPr>
+              <w:t>9 LXC + données, RTO 3 min 15 s, 25 tickets, GLPI HTTPS 200</w:t>
+            </w:r>
+          </w:p>
+        </w:tc>
+      </w:tr>
     </w:tbl>
     <w:p>
       <w:pPr>
@@ -9933,7 +10163,7 @@
           <w:sz w:val="18"/>
           <w:szCs w:val="18"/>
         </w:rPr>
-        <w:t>Journal de preuves horodaté (RPO ≤ 15 min, détection ≈ 6 min, restauration granulaire 36 s).</w:t>
+        <w:t>Journal de preuves horodaté (RPO ≤ 15 min, détection ≈ 6 min, restauration granulaire 36 s, RTO 3 min 15 s).</w:t>
       </w:r>
     </w:p>
     <w:p>
@@ -10022,7 +10252,7 @@
       <w:pPr>
         <w:pStyle w:val="Titre1"/>
       </w:pPr>
-      <w:bookmarkStart w:id="19" w:name="_Toc235050216"/>
+      <w:bookmarkStart w:id="19" w:name="_Toc235056722"/>
       <w:r>
         <w:lastRenderedPageBreak/>
         <w:t>7. Supervision et alertes</w:t>
@@ -10047,7 +10277,7 @@
           <w:noProof/>
         </w:rPr>
         <w:drawing>
-          <wp:inline distT="0" distB="0" distL="0" distR="0" wp14:anchorId="02999E4E" wp14:editId="5A5AC34B">
+          <wp:inline distT="0" distB="0" distL="0" distR="0" wp14:anchorId="5629EFBE" wp14:editId="21DF2DCF">
             <wp:extent cx="5715000" cy="3571875"/>
             <wp:effectExtent l="0" t="0" r="0" b="0"/>
             <wp:docPr id="4" name="grafana_atlas.png" descr="Grafana — dashboard « Atlas — Vue d'ensemble » : agent en ligne, uptime 97 j, CPU/mémoire, charge système (les pics correspondent aux tests chaos)." title="Grafana — dashboard « Atlas — Vue d'ensemble » : agent en ligne, uptime 97 j, CPU/mémoire, charge système (les pics correspondent aux tests chaos)."/>
@@ -10123,7 +10353,7 @@
         </w:rPr>
         <w:lastRenderedPageBreak/>
         <w:drawing>
-          <wp:inline distT="0" distB="0" distL="0" distR="0" wp14:anchorId="6702ED7C" wp14:editId="765DABB3">
+          <wp:inline distT="0" distB="0" distL="0" distR="0" wp14:anchorId="09ED1341" wp14:editId="670848CD">
             <wp:extent cx="5715000" cy="3571875"/>
             <wp:effectExtent l="0" t="0" r="0" b="0"/>
             <wp:docPr id="5" name="zabbix_hosts.png" descr="Zabbix — inventaire des hôtes supervisés (rappel), tous disponibles." title="Zabbix — inventaire des hôtes supervisés (rappel), tous disponibles."/>
@@ -10205,7 +10435,7 @@
       <w:pPr>
         <w:pStyle w:val="Titre1"/>
       </w:pPr>
-      <w:bookmarkStart w:id="20" w:name="_Toc235050217"/>
+      <w:bookmarkStart w:id="20" w:name="_Toc235056723"/>
       <w:r>
         <w:lastRenderedPageBreak/>
         <w:t>8. Matrice de risques et BIA light</w:t>
@@ -11121,7 +11351,7 @@
       <w:pPr>
         <w:pStyle w:val="Titre2"/>
       </w:pPr>
-      <w:bookmarkStart w:id="21" w:name="_Toc235050218"/>
+      <w:bookmarkStart w:id="21" w:name="_Toc235056724"/>
       <w:r>
         <w:t>BIA — services critiques</w:t>
       </w:r>
@@ -11188,7 +11418,7 @@
       <w:pPr>
         <w:pStyle w:val="Titre1"/>
       </w:pPr>
-      <w:bookmarkStart w:id="22" w:name="_Toc235050219"/>
+      <w:bookmarkStart w:id="22" w:name="_Toc235056725"/>
       <w:r>
         <w:lastRenderedPageBreak/>
         <w:t>9. Guide utilisateur GLPI</w:t>
@@ -11213,7 +11443,7 @@
           <w:noProof/>
         </w:rPr>
         <w:drawing>
-          <wp:inline distT="0" distB="0" distL="0" distR="0" wp14:anchorId="0290E353" wp14:editId="0B6D8CD8">
+          <wp:inline distT="0" distB="0" distL="0" distR="0" wp14:anchorId="43DDD669" wp14:editId="3077503D">
             <wp:extent cx="5715000" cy="3571875"/>
             <wp:effectExtent l="0" t="0" r="0" b="0"/>
             <wp:docPr id="6" name="glpi_login.png" descr="GLPI — page de connexion (accès HTTPS via le reverse proxy)." title="GLPI — page de connexion (accès HTTPS via le reverse proxy)."/>
@@ -11341,7 +11571,7 @@
         </w:rPr>
         <w:lastRenderedPageBreak/>
         <w:drawing>
-          <wp:inline distT="0" distB="0" distL="0" distR="0" wp14:anchorId="04C0FBF6" wp14:editId="7A8ECD64">
+          <wp:inline distT="0" distB="0" distL="0" distR="0" wp14:anchorId="6C4E02AF" wp14:editId="07C9DB34">
             <wp:extent cx="5715000" cy="3571875"/>
             <wp:effectExtent l="0" t="0" r="0" b="0"/>
             <wp:docPr id="7" name="glpi_tickets.png" descr="GLPI — liste des tickets avec statuts, priorités et demandeurs (données réelles)." title="GLPI — liste des tickets avec statuts, priorités et demandeurs (données réelles)."/>
@@ -11415,7 +11645,7 @@
       <w:pPr>
         <w:pStyle w:val="Titre1"/>
       </w:pPr>
-      <w:bookmarkStart w:id="23" w:name="_Toc235050220"/>
+      <w:bookmarkStart w:id="23" w:name="_Toc235056726"/>
       <w:r>
         <w:lastRenderedPageBreak/>
         <w:t>10. Plan de transfert de compétences</w:t>
@@ -11483,7 +11713,7 @@
       <w:pPr>
         <w:pStyle w:val="Titre1"/>
       </w:pPr>
-      <w:bookmarkStart w:id="24" w:name="_Toc235050221"/>
+      <w:bookmarkStart w:id="24" w:name="_Toc235056727"/>
       <w:r>
         <w:lastRenderedPageBreak/>
         <w:t>11. Recette, conformité et constats</w:t>
@@ -11494,7 +11724,7 @@
       <w:pPr>
         <w:pStyle w:val="Titre2"/>
       </w:pPr>
-      <w:bookmarkStart w:id="25" w:name="_Toc235050222"/>
+      <w:bookmarkStart w:id="25" w:name="_Toc235056728"/>
       <w:r>
         <w:t>11.1 Recette technique et fonctionnelle</w:t>
       </w:r>
@@ -11543,7 +11773,7 @@
       <w:pPr>
         <w:pStyle w:val="Titre2"/>
       </w:pPr>
-      <w:bookmarkStart w:id="26" w:name="_Toc235050223"/>
+      <w:bookmarkStart w:id="26" w:name="_Toc235056729"/>
       <w:r>
         <w:t>11.2 Constats de recette (corrigés et à corriger)</w:t>
       </w:r>
@@ -11714,7 +11944,7 @@
                 <w:sz w:val="17"/>
                 <w:szCs w:val="17"/>
               </w:rPr>
-              <w:t>Supervision du bastion injoignable (flux VLAN30→90 manquant)</w:t>
+              <w:t>Supervision du bastion injoignable (flux VLAN30→90)</w:t>
             </w:r>
           </w:p>
         </w:tc>
@@ -11770,7 +12000,7 @@
                 <w:sz w:val="17"/>
                 <w:szCs w:val="17"/>
               </w:rPr>
-              <w:t>Corrigé (playbook)</w:t>
+              <w:t>Corrigé</w:t>
             </w:r>
           </w:p>
         </w:tc>
@@ -11806,7 +12036,7 @@
                 <w:sz w:val="17"/>
                 <w:szCs w:val="17"/>
               </w:rPr>
-              <w:t>Agent Zabbix local en ECONNRESET (Server= incomplet)</w:t>
+              <w:t>Agent Zabbix local en ECONNRESET (Server=)</w:t>
             </w:r>
           </w:p>
         </w:tc>
@@ -11862,7 +12092,7 @@
                 <w:sz w:val="17"/>
                 <w:szCs w:val="17"/>
               </w:rPr>
-              <w:t>Corrigé (playbook)</w:t>
+              <w:t>Corrigé</w:t>
             </w:r>
           </w:p>
         </w:tc>
@@ -11898,7 +12128,7 @@
                 <w:sz w:val="17"/>
                 <w:szCs w:val="17"/>
               </w:rPr>
-              <w:t>Items internes « not supported » polluant le dashboard</w:t>
+              <w:t>Items internes « not supported » (dashboard)</w:t>
             </w:r>
           </w:p>
         </w:tc>
@@ -11954,7 +12184,7 @@
                 <w:sz w:val="17"/>
                 <w:szCs w:val="17"/>
               </w:rPr>
-              <w:t>Corrigé (playbook)</w:t>
+              <w:t>Corrigé</w:t>
             </w:r>
           </w:p>
         </w:tc>
@@ -11990,7 +12220,7 @@
                 <w:sz w:val="17"/>
                 <w:szCs w:val="17"/>
               </w:rPr>
-              <w:t>Restauration granulaire : table glpi_tickets_groups inexistante</w:t>
+              <w:t>Restauration granulaire : table glpi_tickets_groups</w:t>
             </w:r>
           </w:p>
         </w:tc>
@@ -12046,7 +12276,7 @@
                 <w:sz w:val="17"/>
                 <w:szCs w:val="17"/>
               </w:rPr>
-              <w:t>Corrigé (glpi_groups_tickets)</w:t>
+              <w:t>Corrigé</w:t>
             </w:r>
           </w:p>
         </w:tc>
@@ -12082,7 +12312,7 @@
                 <w:sz w:val="17"/>
                 <w:szCs w:val="17"/>
               </w:rPr>
-              <w:t>proxmox_validate_certs incohérent (restore complet bloqué)</w:t>
+              <w:t>proxmox_validate_certs (API Proxmox auto-signée)</w:t>
             </w:r>
           </w:p>
         </w:tc>
@@ -12138,7 +12368,7 @@
                 <w:sz w:val="17"/>
                 <w:szCs w:val="17"/>
               </w:rPr>
-              <w:t>Identifié — à corriger</w:t>
+              <w:t>Corrigé</w:t>
             </w:r>
           </w:p>
         </w:tc>
@@ -12174,7 +12404,7 @@
                 <w:sz w:val="17"/>
                 <w:szCs w:val="17"/>
               </w:rPr>
-              <w:t>Comptes GLPI par défaut actifs, vault_glpi_admin_password absent</w:t>
+              <w:t>Comptes GLPI par défaut actifs + secret admin absent</w:t>
             </w:r>
           </w:p>
         </w:tc>
@@ -12230,7 +12460,375 @@
                 <w:sz w:val="17"/>
                 <w:szCs w:val="17"/>
               </w:rPr>
-              <w:t>Identifié — à corriger</w:t>
+              <w:t>Corrigé (durci)</w:t>
+            </w:r>
+          </w:p>
+        </w:tc>
+      </w:tr>
+      <w:tr>
+        <w:tblPrEx>
+          <w:tblCellMar>
+            <w:top w:w="0" w:type="dxa"/>
+            <w:bottom w:w="0" w:type="dxa"/>
+          </w:tblCellMar>
+        </w:tblPrEx>
+        <w:tc>
+          <w:tcPr>
+            <w:tcW w:w="4600" w:type="dxa"/>
+            <w:tcBorders>
+              <w:top w:val="single" w:sz="1" w:space="0" w:color="C9D4E0"/>
+              <w:left w:val="single" w:sz="1" w:space="0" w:color="C9D4E0"/>
+              <w:bottom w:val="single" w:sz="1" w:space="0" w:color="C9D4E0"/>
+              <w:right w:val="single" w:sz="1" w:space="0" w:color="C9D4E0"/>
+            </w:tcBorders>
+            <w:shd w:val="clear" w:color="auto" w:fill="FFFFFF"/>
+            <w:tcMar>
+              <w:top w:w="50" w:type="dxa"/>
+              <w:left w:w="100" w:type="dxa"/>
+              <w:bottom w:w="50" w:type="dxa"/>
+              <w:right w:w="100" w:type="dxa"/>
+            </w:tcMar>
+            <w:vAlign w:val="center"/>
+          </w:tcPr>
+          <w:p>
+            <w:r>
+              <w:rPr>
+                <w:sz w:val="17"/>
+                <w:szCs w:val="17"/>
+              </w:rPr>
+              <w:t>Dépendances restore absentes (python3-cryptography, rsync)</w:t>
+            </w:r>
+          </w:p>
+        </w:tc>
+        <w:tc>
+          <w:tcPr>
+            <w:tcW w:w="2100" w:type="dxa"/>
+            <w:tcBorders>
+              <w:top w:val="single" w:sz="1" w:space="0" w:color="C9D4E0"/>
+              <w:left w:val="single" w:sz="1" w:space="0" w:color="C9D4E0"/>
+              <w:bottom w:val="single" w:sz="1" w:space="0" w:color="C9D4E0"/>
+              <w:right w:val="single" w:sz="1" w:space="0" w:color="C9D4E0"/>
+            </w:tcBorders>
+            <w:shd w:val="clear" w:color="auto" w:fill="FFFFFF"/>
+            <w:tcMar>
+              <w:top w:w="50" w:type="dxa"/>
+              <w:left w:w="100" w:type="dxa"/>
+              <w:bottom w:w="50" w:type="dxa"/>
+              <w:right w:w="100" w:type="dxa"/>
+            </w:tcMar>
+            <w:vAlign w:val="center"/>
+          </w:tcPr>
+          <w:p>
+            <w:r>
+              <w:rPr>
+                <w:sz w:val="17"/>
+                <w:szCs w:val="17"/>
+              </w:rPr>
+              <w:t>PRA (deps)</w:t>
+            </w:r>
+          </w:p>
+        </w:tc>
+        <w:tc>
+          <w:tcPr>
+            <w:tcW w:w="2660" w:type="dxa"/>
+            <w:tcBorders>
+              <w:top w:val="single" w:sz="1" w:space="0" w:color="C9D4E0"/>
+              <w:left w:val="single" w:sz="1" w:space="0" w:color="C9D4E0"/>
+              <w:bottom w:val="single" w:sz="1" w:space="0" w:color="C9D4E0"/>
+              <w:right w:val="single" w:sz="1" w:space="0" w:color="C9D4E0"/>
+            </w:tcBorders>
+            <w:shd w:val="clear" w:color="auto" w:fill="FFFFFF"/>
+            <w:tcMar>
+              <w:top w:w="50" w:type="dxa"/>
+              <w:left w:w="100" w:type="dxa"/>
+              <w:bottom w:w="50" w:type="dxa"/>
+              <w:right w:w="100" w:type="dxa"/>
+            </w:tcMar>
+            <w:vAlign w:val="center"/>
+          </w:tcPr>
+          <w:p>
+            <w:r>
+              <w:rPr>
+                <w:sz w:val="17"/>
+                <w:szCs w:val="17"/>
+              </w:rPr>
+              <w:t>Corrigé (common)</w:t>
+            </w:r>
+          </w:p>
+        </w:tc>
+      </w:tr>
+      <w:tr>
+        <w:tblPrEx>
+          <w:tblCellMar>
+            <w:top w:w="0" w:type="dxa"/>
+            <w:bottom w:w="0" w:type="dxa"/>
+          </w:tblCellMar>
+        </w:tblPrEx>
+        <w:tc>
+          <w:tcPr>
+            <w:tcW w:w="4600" w:type="dxa"/>
+            <w:tcBorders>
+              <w:top w:val="single" w:sz="1" w:space="0" w:color="C9D4E0"/>
+              <w:left w:val="single" w:sz="1" w:space="0" w:color="C9D4E0"/>
+              <w:bottom w:val="single" w:sz="1" w:space="0" w:color="C9D4E0"/>
+              <w:right w:val="single" w:sz="1" w:space="0" w:color="C9D4E0"/>
+            </w:tcBorders>
+            <w:shd w:val="clear" w:color="auto" w:fill="EEF3F8"/>
+            <w:tcMar>
+              <w:top w:w="50" w:type="dxa"/>
+              <w:left w:w="100" w:type="dxa"/>
+              <w:bottom w:w="50" w:type="dxa"/>
+              <w:right w:w="100" w:type="dxa"/>
+            </w:tcMar>
+            <w:vAlign w:val="center"/>
+          </w:tcPr>
+          <w:p>
+            <w:r>
+              <w:rPr>
+                <w:sz w:val="17"/>
+                <w:szCs w:val="17"/>
+              </w:rPr>
+              <w:t>Secret vault_zabbix_grafana_password absent</w:t>
+            </w:r>
+          </w:p>
+        </w:tc>
+        <w:tc>
+          <w:tcPr>
+            <w:tcW w:w="2100" w:type="dxa"/>
+            <w:tcBorders>
+              <w:top w:val="single" w:sz="1" w:space="0" w:color="C9D4E0"/>
+              <w:left w:val="single" w:sz="1" w:space="0" w:color="C9D4E0"/>
+              <w:bottom w:val="single" w:sz="1" w:space="0" w:color="C9D4E0"/>
+              <w:right w:val="single" w:sz="1" w:space="0" w:color="C9D4E0"/>
+            </w:tcBorders>
+            <w:shd w:val="clear" w:color="auto" w:fill="EEF3F8"/>
+            <w:tcMar>
+              <w:top w:w="50" w:type="dxa"/>
+              <w:left w:w="100" w:type="dxa"/>
+              <w:bottom w:w="50" w:type="dxa"/>
+              <w:right w:w="100" w:type="dxa"/>
+            </w:tcMar>
+            <w:vAlign w:val="center"/>
+          </w:tcPr>
+          <w:p>
+            <w:r>
+              <w:rPr>
+                <w:sz w:val="17"/>
+                <w:szCs w:val="17"/>
+              </w:rPr>
+              <w:t>Sécurité/PRA</w:t>
+            </w:r>
+          </w:p>
+        </w:tc>
+        <w:tc>
+          <w:tcPr>
+            <w:tcW w:w="2660" w:type="dxa"/>
+            <w:tcBorders>
+              <w:top w:val="single" w:sz="1" w:space="0" w:color="C9D4E0"/>
+              <w:left w:val="single" w:sz="1" w:space="0" w:color="C9D4E0"/>
+              <w:bottom w:val="single" w:sz="1" w:space="0" w:color="C9D4E0"/>
+              <w:right w:val="single" w:sz="1" w:space="0" w:color="C9D4E0"/>
+            </w:tcBorders>
+            <w:shd w:val="clear" w:color="auto" w:fill="EEF3F8"/>
+            <w:tcMar>
+              <w:top w:w="50" w:type="dxa"/>
+              <w:left w:w="100" w:type="dxa"/>
+              <w:bottom w:w="50" w:type="dxa"/>
+              <w:right w:w="100" w:type="dxa"/>
+            </w:tcMar>
+            <w:vAlign w:val="center"/>
+          </w:tcPr>
+          <w:p>
+            <w:r>
+              <w:rPr>
+                <w:sz w:val="17"/>
+                <w:szCs w:val="17"/>
+              </w:rPr>
+              <w:t>Corrigé (vault)</w:t>
+            </w:r>
+          </w:p>
+        </w:tc>
+      </w:tr>
+      <w:tr>
+        <w:tblPrEx>
+          <w:tblCellMar>
+            <w:top w:w="0" w:type="dxa"/>
+            <w:bottom w:w="0" w:type="dxa"/>
+          </w:tblCellMar>
+        </w:tblPrEx>
+        <w:tc>
+          <w:tcPr>
+            <w:tcW w:w="4600" w:type="dxa"/>
+            <w:tcBorders>
+              <w:top w:val="single" w:sz="1" w:space="0" w:color="C9D4E0"/>
+              <w:left w:val="single" w:sz="1" w:space="0" w:color="C9D4E0"/>
+              <w:bottom w:val="single" w:sz="1" w:space="0" w:color="C9D4E0"/>
+              <w:right w:val="single" w:sz="1" w:space="0" w:color="C9D4E0"/>
+            </w:tcBorders>
+            <w:shd w:val="clear" w:color="auto" w:fill="FFFFFF"/>
+            <w:tcMar>
+              <w:top w:w="50" w:type="dxa"/>
+              <w:left w:w="100" w:type="dxa"/>
+              <w:bottom w:w="50" w:type="dxa"/>
+              <w:right w:w="100" w:type="dxa"/>
+            </w:tcMar>
+            <w:vAlign w:val="center"/>
+          </w:tcPr>
+          <w:p>
+            <w:r>
+              <w:rPr>
+                <w:sz w:val="17"/>
+                <w:szCs w:val="17"/>
+              </w:rPr>
+              <w:t>Sélection du dump : SIGPIPE + réplique 0 octet</w:t>
+            </w:r>
+          </w:p>
+        </w:tc>
+        <w:tc>
+          <w:tcPr>
+            <w:tcW w:w="2100" w:type="dxa"/>
+            <w:tcBorders>
+              <w:top w:val="single" w:sz="1" w:space="0" w:color="C9D4E0"/>
+              <w:left w:val="single" w:sz="1" w:space="0" w:color="C9D4E0"/>
+              <w:bottom w:val="single" w:sz="1" w:space="0" w:color="C9D4E0"/>
+              <w:right w:val="single" w:sz="1" w:space="0" w:color="C9D4E0"/>
+            </w:tcBorders>
+            <w:shd w:val="clear" w:color="auto" w:fill="FFFFFF"/>
+            <w:tcMar>
+              <w:top w:w="50" w:type="dxa"/>
+              <w:left w:w="100" w:type="dxa"/>
+              <w:bottom w:w="50" w:type="dxa"/>
+              <w:right w:w="100" w:type="dxa"/>
+            </w:tcMar>
+            <w:vAlign w:val="center"/>
+          </w:tcPr>
+          <w:p>
+            <w:r>
+              <w:rPr>
+                <w:sz w:val="17"/>
+                <w:szCs w:val="17"/>
+              </w:rPr>
+              <w:t>PRA (bug)</w:t>
+            </w:r>
+          </w:p>
+        </w:tc>
+        <w:tc>
+          <w:tcPr>
+            <w:tcW w:w="2660" w:type="dxa"/>
+            <w:tcBorders>
+              <w:top w:val="single" w:sz="1" w:space="0" w:color="C9D4E0"/>
+              <w:left w:val="single" w:sz="1" w:space="0" w:color="C9D4E0"/>
+              <w:bottom w:val="single" w:sz="1" w:space="0" w:color="C9D4E0"/>
+              <w:right w:val="single" w:sz="1" w:space="0" w:color="C9D4E0"/>
+            </w:tcBorders>
+            <w:shd w:val="clear" w:color="auto" w:fill="FFFFFF"/>
+            <w:tcMar>
+              <w:top w:w="50" w:type="dxa"/>
+              <w:left w:w="100" w:type="dxa"/>
+              <w:bottom w:w="50" w:type="dxa"/>
+              <w:right w:w="100" w:type="dxa"/>
+            </w:tcMar>
+            <w:vAlign w:val="center"/>
+          </w:tcPr>
+          <w:p>
+            <w:r>
+              <w:rPr>
+                <w:sz w:val="17"/>
+                <w:szCs w:val="17"/>
+              </w:rPr>
+              <w:t>Corrigé (dump valide)</w:t>
+            </w:r>
+          </w:p>
+        </w:tc>
+      </w:tr>
+      <w:tr>
+        <w:tblPrEx>
+          <w:tblCellMar>
+            <w:top w:w="0" w:type="dxa"/>
+            <w:bottom w:w="0" w:type="dxa"/>
+          </w:tblCellMar>
+        </w:tblPrEx>
+        <w:tc>
+          <w:tcPr>
+            <w:tcW w:w="4600" w:type="dxa"/>
+            <w:tcBorders>
+              <w:top w:val="single" w:sz="1" w:space="0" w:color="C9D4E0"/>
+              <w:left w:val="single" w:sz="1" w:space="0" w:color="C9D4E0"/>
+              <w:bottom w:val="single" w:sz="1" w:space="0" w:color="C9D4E0"/>
+              <w:right w:val="single" w:sz="1" w:space="0" w:color="C9D4E0"/>
+            </w:tcBorders>
+            <w:shd w:val="clear" w:color="auto" w:fill="EEF3F8"/>
+            <w:tcMar>
+              <w:top w:w="50" w:type="dxa"/>
+              <w:left w:w="100" w:type="dxa"/>
+              <w:bottom w:w="50" w:type="dxa"/>
+              <w:right w:w="100" w:type="dxa"/>
+            </w:tcMar>
+            <w:vAlign w:val="center"/>
+          </w:tcPr>
+          <w:p>
+            <w:r>
+              <w:rPr>
+                <w:sz w:val="17"/>
+                <w:szCs w:val="17"/>
+              </w:rPr>
+              <w:t>Flux Backup→GLPI:22 + permissions filestore</w:t>
+            </w:r>
+          </w:p>
+        </w:tc>
+        <w:tc>
+          <w:tcPr>
+            <w:tcW w:w="2100" w:type="dxa"/>
+            <w:tcBorders>
+              <w:top w:val="single" w:sz="1" w:space="0" w:color="C9D4E0"/>
+              <w:left w:val="single" w:sz="1" w:space="0" w:color="C9D4E0"/>
+              <w:bottom w:val="single" w:sz="1" w:space="0" w:color="C9D4E0"/>
+              <w:right w:val="single" w:sz="1" w:space="0" w:color="C9D4E0"/>
+            </w:tcBorders>
+            <w:shd w:val="clear" w:color="auto" w:fill="EEF3F8"/>
+            <w:tcMar>
+              <w:top w:w="50" w:type="dxa"/>
+              <w:left w:w="100" w:type="dxa"/>
+              <w:bottom w:w="50" w:type="dxa"/>
+              <w:right w:w="100" w:type="dxa"/>
+            </w:tcMar>
+            <w:vAlign w:val="center"/>
+          </w:tcPr>
+          <w:p>
+            <w:r>
+              <w:rPr>
+                <w:sz w:val="17"/>
+                <w:szCs w:val="17"/>
+              </w:rPr>
+              <w:t>PRA (réseau/perms)</w:t>
+            </w:r>
+          </w:p>
+        </w:tc>
+        <w:tc>
+          <w:tcPr>
+            <w:tcW w:w="2660" w:type="dxa"/>
+            <w:tcBorders>
+              <w:top w:val="single" w:sz="1" w:space="0" w:color="C9D4E0"/>
+              <w:left w:val="single" w:sz="1" w:space="0" w:color="C9D4E0"/>
+              <w:bottom w:val="single" w:sz="1" w:space="0" w:color="C9D4E0"/>
+              <w:right w:val="single" w:sz="1" w:space="0" w:color="C9D4E0"/>
+            </w:tcBorders>
+            <w:shd w:val="clear" w:color="auto" w:fill="EEF3F8"/>
+            <w:tcMar>
+              <w:top w:w="50" w:type="dxa"/>
+              <w:left w:w="100" w:type="dxa"/>
+              <w:bottom w:w="50" w:type="dxa"/>
+              <w:right w:w="100" w:type="dxa"/>
+            </w:tcMar>
+            <w:vAlign w:val="center"/>
+          </w:tcPr>
+          <w:p>
+            <w:r>
+              <w:rPr>
+                <w:sz w:val="17"/>
+                <w:szCs w:val="17"/>
+              </w:rPr>
+              <w:t>Corrigé</w:t>
             </w:r>
           </w:p>
         </w:tc>
@@ -12266,7 +12864,7 @@
       <w:pPr>
         <w:pStyle w:val="Titre2"/>
       </w:pPr>
-      <w:bookmarkStart w:id="27" w:name="_Toc235050224"/>
+      <w:bookmarkStart w:id="27" w:name="_Toc235056730"/>
       <w:r>
         <w:t>11.3 Tableau de conformité aux critères du sujet</w:t>
       </w:r>
@@ -12889,7 +13487,7 @@
                 <w:sz w:val="17"/>
                 <w:szCs w:val="17"/>
               </w:rPr>
-              <w:t>Runbook de restauration complète</w:t>
+              <w:t>RTO ≤ 40 min (restauration complète)</w:t>
             </w:r>
           </w:p>
         </w:tc>
@@ -12917,7 +13515,7 @@
                 <w:sz w:val="17"/>
                 <w:szCs w:val="17"/>
               </w:rPr>
-              <w:t>Livré</w:t>
+              <w:t>Atteint (3 min 15 s)</w:t>
             </w:r>
           </w:p>
         </w:tc>
@@ -12945,7 +13543,7 @@
                 <w:sz w:val="17"/>
                 <w:szCs w:val="17"/>
               </w:rPr>
-              <w:t>§4.1 (runbook + constat §11)</w:t>
+              <w:t>§4.1, §6, Annexe A</w:t>
             </w:r>
           </w:p>
         </w:tc>
@@ -13262,7 +13860,7 @@
       <w:pPr>
         <w:pStyle w:val="Titre1"/>
       </w:pPr>
-      <w:bookmarkStart w:id="28" w:name="_Toc235050225"/>
+      <w:bookmarkStart w:id="28" w:name="_Toc235056731"/>
       <w:r>
         <w:lastRenderedPageBreak/>
         <w:t>Annexes</w:t>
@@ -13273,9 +13871,9 @@
       <w:pPr>
         <w:pStyle w:val="Titre2"/>
       </w:pPr>
-      <w:bookmarkStart w:id="29" w:name="_Toc235050226"/>
+      <w:bookmarkStart w:id="29" w:name="_Toc235056732"/>
       <w:r>
-        <w:t>A. Sortie complète de la restauration complète (extrait)</w:t>
+        <w:t>A. Sortie de la restauration complète — RTO mesuré (extrait réel)</w:t>
       </w:r>
       <w:bookmarkEnd w:id="29"/>
     </w:p>
@@ -13284,7 +13882,7 @@
         <w:spacing w:after="120"/>
       </w:pPr>
       <w:r>
-        <w:t>Extrait réel de l'exécution de pra_restore_full.yaml (interrompue par le constat validate_certs, cf. §11) :</w:t>
+        <w:t>Extrait réel de l'exécution RÉUSSIE de pra_restore_full.yaml le 16/07/2026 (reconstruction des 9 conteneurs, restauration base + filestore, vérifications, RTO auto-mesuré) :</w:t>
       </w:r>
     </w:p>
     <w:tbl>
@@ -13339,7 +13937,7 @@
                 <w:sz w:val="15"/>
                 <w:szCs w:val="15"/>
               </w:rPr>
-              <w:t>[WARNING]: Collection ansible.posix does not support Ansible version 2.14.18</w:t>
+              <w:t>TASK [glpi : Vérifier que GLPI répond en HTTP] *********************************</w:t>
             </w:r>
           </w:p>
           <w:p>
@@ -13350,7 +13948,7 @@
                 <w:sz w:val="15"/>
                 <w:szCs w:val="15"/>
               </w:rPr>
-              <w:t>[WARNING]: Collection community.crypto does not support Ansible version 2.14.18</w:t>
+              <w:t>TASK [zabbix : Autoriser le trapper Zabbix (port 10051)] ***********************</w:t>
             </w:r>
           </w:p>
           <w:p>
@@ -13361,7 +13959,7 @@
                 <w:sz w:val="15"/>
                 <w:szCs w:val="15"/>
               </w:rPr>
-              <w:t xml:space="preserve"> </w:t>
+              <w:t>TASK [Fixer le chemin du dump retenu] ******************************************</w:t>
             </w:r>
           </w:p>
           <w:p>
@@ -13372,7 +13970,7 @@
                 <w:sz w:val="15"/>
                 <w:szCs w:val="15"/>
               </w:rPr>
-              <w:t>PLAY [PRA — Horodatage de début] ***********************************************</w:t>
+              <w:t>TASK [Afficher le dump retenu pour la restauration] ****************************</w:t>
             </w:r>
           </w:p>
           <w:p>
@@ -13383,7 +13981,7 @@
                 <w:sz w:val="15"/>
                 <w:szCs w:val="15"/>
               </w:rPr>
-              <w:t xml:space="preserve"> </w:t>
+              <w:t>msg: 'Dump retenu : /var/backups/atlas/db-remote/glpi_dump_20260716_005001.sql.gz'</w:t>
             </w:r>
           </w:p>
           <w:p>
@@ -13394,7 +13992,7 @@
                 <w:sz w:val="15"/>
                 <w:szCs w:val="15"/>
               </w:rPr>
-              <w:t>TASK [Enregistrer l'horodatage de début (epoch)] *******************************</w:t>
+              <w:t>TASK [Restaurer la base glpi_db depuis le dump] ********************************</w:t>
             </w:r>
           </w:p>
           <w:p>
@@ -13405,7 +14003,7 @@
                 <w:sz w:val="15"/>
                 <w:szCs w:val="15"/>
               </w:rPr>
-              <w:t>ok: [proxmox_node]</w:t>
+              <w:t>TASK [Restaurer le filestore GLPI depuis atlbkp01p vers atlapp01p] *************</w:t>
             </w:r>
           </w:p>
           <w:p>
@@ -13416,7 +14014,7 @@
                 <w:sz w:val="15"/>
                 <w:szCs w:val="15"/>
               </w:rPr>
-              <w:t xml:space="preserve"> </w:t>
+              <w:t>TASK [Remettre les permissions www-data sur le filestore GLPI] *****************</w:t>
             </w:r>
           </w:p>
           <w:p>
@@ -13427,7 +14025,7 @@
                 <w:sz w:val="15"/>
                 <w:szCs w:val="15"/>
               </w:rPr>
-              <w:t>TASK [Créer le répertoire de journalisation PRA] *******************************</w:t>
+              <w:t>TASK [Vérifier que GLPI répond en HTTP (backend direct)] ***********************</w:t>
             </w:r>
           </w:p>
           <w:p>
@@ -13438,7 +14036,7 @@
                 <w:sz w:val="15"/>
                 <w:szCs w:val="15"/>
               </w:rPr>
-              <w:t>changed: [proxmox_node]</w:t>
+              <w:t>TASK [Vérifier que GLPI répond via le reverse proxy HTTPS] *********************</w:t>
             </w:r>
           </w:p>
           <w:p>
@@ -13449,7 +14047,7 @@
                 <w:sz w:val="15"/>
                 <w:szCs w:val="15"/>
               </w:rPr>
-              <w:t xml:space="preserve"> </w:t>
+              <w:t>msg: 'Vérification base : [''COUNT(*)'', ''25'']'</w:t>
             </w:r>
           </w:p>
           <w:p>
@@ -13460,7 +14058,7 @@
                 <w:sz w:val="15"/>
                 <w:szCs w:val="15"/>
               </w:rPr>
-              <w:t>TASK [Journaliser le début de la restauration complète] ************************</w:t>
+              <w:t>TASK [Vérifier que le port 10051 du serveur Zabbix est ouvert] *****************</w:t>
             </w:r>
           </w:p>
           <w:p>
@@ -13471,7 +14069,7 @@
                 <w:sz w:val="15"/>
                 <w:szCs w:val="15"/>
               </w:rPr>
-              <w:t>changed: [proxmox_node]</w:t>
+              <w:t>TASK [Afficher le RTO mesuré] **************************************************</w:t>
             </w:r>
           </w:p>
           <w:p>
@@ -13482,7 +14080,7 @@
                 <w:sz w:val="15"/>
                 <w:szCs w:val="15"/>
               </w:rPr>
-              <w:t xml:space="preserve"> </w:t>
+              <w:t>msg: 'RTO mesuré : 3 minutes 15 secondes (cible : 40 minutes)'</w:t>
             </w:r>
           </w:p>
           <w:p>
@@ -13493,7 +14091,7 @@
                 <w:sz w:val="15"/>
                 <w:szCs w:val="15"/>
               </w:rPr>
-              <w:t>PLAY [PRA — Reprovisioning des LXC] ********************************************</w:t>
+              <w:t>PLAY RECAP *********************************************************************</w:t>
             </w:r>
           </w:p>
           <w:p>
@@ -13504,7 +14102,7 @@
                 <w:sz w:val="15"/>
                 <w:szCs w:val="15"/>
               </w:rPr>
-              <w:t xml:space="preserve"> </w:t>
+              <w:t xml:space="preserve">atlapp01p                  : ok=49   changed=6    unreachable=0    failed=0    skipped=3    rescued=0    ignored=0   </w:t>
             </w:r>
           </w:p>
           <w:p>
@@ -13515,7 +14113,7 @@
                 <w:sz w:val="15"/>
                 <w:szCs w:val="15"/>
               </w:rPr>
-              <w:t>TASK [Gathering Facts] *********************************************************</w:t>
+              <w:t xml:space="preserve">atlbkp01p                  : ok=35   changed=2    unreachable=0    failed=0    skipped=5    rescued=0    ignored=0   </w:t>
             </w:r>
           </w:p>
           <w:p>
@@ -13526,7 +14124,7 @@
                 <w:sz w:val="15"/>
                 <w:szCs w:val="15"/>
               </w:rPr>
-              <w:t>ok: [proxmox_node]</w:t>
+              <w:t xml:space="preserve">atlbst01p                  : ok=31   changed=1    unreachable=0    failed=0    skipped=1    rescued=0    ignored=0   </w:t>
             </w:r>
           </w:p>
           <w:p>
@@ -13537,7 +14135,7 @@
                 <w:sz w:val="15"/>
                 <w:szCs w:val="15"/>
               </w:rPr>
-              <w:t xml:space="preserve"> </w:t>
+              <w:t xml:space="preserve">atldb01p                   : ok=58   changed=7    unreachable=0    failed=0    skipped=9    rescued=0    ignored=0   </w:t>
             </w:r>
           </w:p>
           <w:p>
@@ -13548,7 +14146,7 @@
                 <w:sz w:val="15"/>
                 <w:szCs w:val="15"/>
               </w:rPr>
-              <w:t>TASK [proxmox_provision : Lister le contenu du storage local] ******************</w:t>
+              <w:t xml:space="preserve">atlgrf01p                  : ok=25   changed=1    unreachable=0    failed=0    skipped=1    rescued=0    ignored=0   </w:t>
             </w:r>
           </w:p>
           <w:p>
@@ -13559,7 +14157,7 @@
                 <w:sz w:val="15"/>
                 <w:szCs w:val="15"/>
               </w:rPr>
-              <w:t>ok: [proxmox_node]</w:t>
+              <w:t xml:space="preserve">atlrp01p                   : ok=36   changed=1    unreachable=0    failed=0    skipped=2    rescued=0    ignored=0   </w:t>
             </w:r>
           </w:p>
           <w:p>
@@ -13570,7 +14168,7 @@
                 <w:sz w:val="15"/>
                 <w:szCs w:val="15"/>
               </w:rPr>
-              <w:t xml:space="preserve"> </w:t>
+              <w:t xml:space="preserve">atlsmtp01p                 : ok=33   changed=1    unreachable=0    failed=0    skipped=3    rescued=0    ignored=0   </w:t>
             </w:r>
           </w:p>
           <w:p>
@@ -13581,7 +14179,7 @@
                 <w:sz w:val="15"/>
                 <w:szCs w:val="15"/>
               </w:rPr>
-              <w:t>TASK [proxmox_provision : Vérifier la présence du template Debian 12] **********</w:t>
+              <w:t xml:space="preserve">atltst01p                  : ok=25   changed=1    unreachable=0    failed=0    skipped=1    rescued=0    ignored=0   </w:t>
             </w:r>
           </w:p>
           <w:p>
@@ -13592,7 +14190,7 @@
                 <w:sz w:val="15"/>
                 <w:szCs w:val="15"/>
               </w:rPr>
-              <w:t xml:space="preserve">ok: [proxmox_node] =&gt; changed=false </w:t>
+              <w:t xml:space="preserve">atlzbx01p                  : ok=71   changed=2    unreachable=0    failed=0    skipped=16   rescued=0    ignored=0   </w:t>
             </w:r>
           </w:p>
           <w:p>
@@ -13603,7 +14201,7 @@
                 <w:sz w:val="15"/>
                 <w:szCs w:val="15"/>
               </w:rPr>
-              <w:t xml:space="preserve">  msg: Template LXC Debian 12 présent sur le storage local.</w:t>
+              <w:t xml:space="preserve">proxmox_node               : ok=32   changed=2    unreachable=0    failed=0    skipped=2    rescued=0    ignored=0   </w:t>
             </w:r>
           </w:p>
           <w:p>
@@ -13615,61 +14213,6 @@
                 <w:szCs w:val="15"/>
               </w:rPr>
               <w:t xml:space="preserve"> </w:t>
-            </w:r>
-          </w:p>
-          <w:p>
-            <w:r>
-              <w:rPr>
-                <w:rFonts w:ascii="Consolas" w:eastAsia="Consolas" w:hAnsi="Consolas" w:cs="Consolas"/>
-                <w:color w:val="D4D4D4"/>
-                <w:sz w:val="15"/>
-                <w:szCs w:val="15"/>
-              </w:rPr>
-              <w:t>TASK [proxmox_provision : Afficher le contenu du storage local (debug)] ********</w:t>
-            </w:r>
-          </w:p>
-          <w:p>
-            <w:r>
-              <w:rPr>
-                <w:rFonts w:ascii="Consolas" w:eastAsia="Consolas" w:hAnsi="Consolas" w:cs="Consolas"/>
-                <w:color w:val="D4D4D4"/>
-                <w:sz w:val="15"/>
-                <w:szCs w:val="15"/>
-              </w:rPr>
-              <w:t>skipping: [proxmox_node]</w:t>
-            </w:r>
-          </w:p>
-          <w:p>
-            <w:r>
-              <w:rPr>
-                <w:rFonts w:ascii="Consolas" w:eastAsia="Consolas" w:hAnsi="Consolas" w:cs="Consolas"/>
-                <w:color w:val="D4D4D4"/>
-                <w:sz w:val="15"/>
-                <w:szCs w:val="15"/>
-              </w:rPr>
-              <w:t xml:space="preserve"> </w:t>
-            </w:r>
-          </w:p>
-          <w:p>
-            <w:r>
-              <w:rPr>
-                <w:rFonts w:ascii="Consolas" w:eastAsia="Consolas" w:hAnsi="Consolas" w:cs="Consolas"/>
-                <w:color w:val="D4D4D4"/>
-                <w:sz w:val="15"/>
-                <w:szCs w:val="15"/>
-              </w:rPr>
-              <w:t>TASK [proxmox_provision : Lister les ressources VM/CT du cluster] **************</w:t>
-            </w:r>
-          </w:p>
-          <w:p>
-            <w:r>
-              <w:rPr>
-                <w:rFonts w:ascii="Consolas" w:eastAsia="Consolas" w:hAnsi="Consolas" w:cs="Consolas"/>
-                <w:color w:val="D4D4D4"/>
-                <w:sz w:val="15"/>
-                <w:szCs w:val="15"/>
-              </w:rPr>
-              <w:t>... (extrait tronqué)</w:t>
             </w:r>
           </w:p>
         </w:tc>
@@ -13679,7 +14222,7 @@
       <w:pPr>
         <w:pStyle w:val="Titre2"/>
       </w:pPr>
-      <w:bookmarkStart w:id="30" w:name="_Toc235050227"/>
+      <w:bookmarkStart w:id="30" w:name="_Toc235056733"/>
       <w:r>
         <w:t>B. Glossaire des sigles</w:t>
       </w:r>
@@ -14540,64 +15083,10 @@
 <file path=word/numbering.xml><?xml version="1.0" encoding="utf-8"?>
 <w:numbering xmlns:wpc="http://schemas.microsoft.com/office/word/2010/wordprocessingCanvas" xmlns:cx="http://schemas.microsoft.com/office/drawing/2014/chartex" xmlns:cx1="http://schemas.microsoft.com/office/drawing/2015/9/8/chartex" xmlns:cx2="http://schemas.microsoft.com/office/drawing/2015/10/21/chartex" xmlns:cx3="http://schemas.microsoft.com/office/drawing/2016/5/9/chartex" xmlns:cx4="http://schemas.microsoft.com/office/drawing/2016/5/10/chartex" xmlns:cx5="http://schemas.microsoft.com/office/drawing/2016/5/11/chartex" xmlns:cx6="http://schemas.microsoft.com/office/drawing/2016/5/12/chartex" xmlns:cx7="http://schemas.microsoft.com/office/drawing/2016/5/13/chartex" xmlns:cx8="http://schemas.microsoft.com/office/drawing/2016/5/14/chartex" xmlns:mc="http://schemas.openxmlformats.org/markup-compatibility/2006" xmlns:aink="http://schemas.microsoft.com/office/drawing/2016/ink" xmlns:am3d="http://schemas.microsoft.com/office/drawing/2017/model3d" xmlns:o="urn:schemas-microsoft-com:office:office" xmlns:oel="http://schemas.microsoft.com/office/2019/extlst" xmlns:r="http://schemas.openxmlformats.org/officeDocument/2006/relationships" xmlns:m="http://schemas.openxmlformats.org/officeDocument/2006/math" xmlns:v="urn:schemas-microsoft-com:vml" xmlns:wp14="http://schemas.microsoft.com/office/word/2010/wordprocessingDrawing" xmlns:wp="http://schemas.openxmlformats.org/drawingml/2006/wordprocessingDrawing" xmlns:w10="urn:schemas-microsoft-com:office:word" xmlns:w="http://schemas.openxmlformats.org/wordprocessingml/2006/main" xmlns:w14="http://schemas.microsoft.com/office/word/2010/wordml" xmlns:w15="http://schemas.microsoft.com/office/word/2012/wordml" xmlns:w16cex="http://schemas.microsoft.com/office/word/2018/wordml/cex" xmlns:w16cid="http://schemas.microsoft.com/office/word/2016/wordml/cid" xmlns:w16="http://schemas.microsoft.com/office/word/2018/wordml" xmlns:w16sdtdh="http://schemas.microsoft.com/office/word/2020/wordml/sdtdatahash" xmlns:w16se="http://schemas.microsoft.com/office/word/2015/wordml/symex" xmlns:wpg="http://schemas.microsoft.com/office/word/2010/wordprocessingGroup" xmlns:wpi="http://schemas.microsoft.com/office/word/2010/wordprocessingInk" xmlns:wne="http://schemas.microsoft.com/office/word/2006/wordml" xmlns:wps="http://schemas.microsoft.com/office/word/2010/wordprocessingShape" mc:Ignorable="w14 w15 w16se w16cid w16 w16cex w16sdtdh wp14">
   <w:abstractNum w:abstractNumId="0" w15:restartNumberingAfterBreak="0">
-    <w:nsid w:val="350C5217"/>
+    <w:nsid w:val="0EDA6E57"/>
     <w:multiLevelType w:val="hybridMultilevel"/>
-    <w:tmpl w:val="09EAC14C"/>
-    <w:lvl w:ilvl="0" w:tplc="39E42FB0">
-      <w:start w:val="1"/>
-      <w:numFmt w:val="bullet"/>
-      <w:lvlText w:val="•"/>
-      <w:lvlJc w:val="left"/>
-      <w:pPr>
-        <w:ind w:left="620" w:hanging="320"/>
-      </w:pPr>
-    </w:lvl>
-    <w:lvl w:ilvl="1" w:tplc="E0584D40">
-      <w:numFmt w:val="decimal"/>
-      <w:lvlText w:val=""/>
-      <w:lvlJc w:val="left"/>
-    </w:lvl>
-    <w:lvl w:ilvl="2" w:tplc="098E0BE8">
-      <w:numFmt w:val="decimal"/>
-      <w:lvlText w:val=""/>
-      <w:lvlJc w:val="left"/>
-    </w:lvl>
-    <w:lvl w:ilvl="3" w:tplc="090A02FC">
-      <w:numFmt w:val="decimal"/>
-      <w:lvlText w:val=""/>
-      <w:lvlJc w:val="left"/>
-    </w:lvl>
-    <w:lvl w:ilvl="4" w:tplc="DC80D08A">
-      <w:numFmt w:val="decimal"/>
-      <w:lvlText w:val=""/>
-      <w:lvlJc w:val="left"/>
-    </w:lvl>
-    <w:lvl w:ilvl="5" w:tplc="D488E5B6">
-      <w:numFmt w:val="decimal"/>
-      <w:lvlText w:val=""/>
-      <w:lvlJc w:val="left"/>
-    </w:lvl>
-    <w:lvl w:ilvl="6" w:tplc="2612CB04">
-      <w:numFmt w:val="decimal"/>
-      <w:lvlText w:val=""/>
-      <w:lvlJc w:val="left"/>
-    </w:lvl>
-    <w:lvl w:ilvl="7" w:tplc="13841CC0">
-      <w:numFmt w:val="decimal"/>
-      <w:lvlText w:val=""/>
-      <w:lvlJc w:val="left"/>
-    </w:lvl>
-    <w:lvl w:ilvl="8" w:tplc="62F84030">
-      <w:numFmt w:val="decimal"/>
-      <w:lvlText w:val=""/>
-      <w:lvlJc w:val="left"/>
-    </w:lvl>
-  </w:abstractNum>
-  <w:abstractNum w:abstractNumId="1" w15:restartNumberingAfterBreak="0">
-    <w:nsid w:val="54FA448D"/>
-    <w:multiLevelType w:val="hybridMultilevel"/>
-    <w:tmpl w:val="333E2322"/>
-    <w:lvl w:ilvl="0" w:tplc="157487C0">
+    <w:tmpl w:val="9BBABADE"/>
+    <w:lvl w:ilvl="0" w:tplc="746E05F2">
       <w:start w:val="1"/>
       <w:numFmt w:val="bullet"/>
       <w:lvlText w:val="●"/>
@@ -14606,7 +15095,7 @@
         <w:ind w:left="720" w:hanging="360"/>
       </w:pPr>
     </w:lvl>
-    <w:lvl w:ilvl="1" w:tplc="377032C8">
+    <w:lvl w:ilvl="1" w:tplc="82C65448">
       <w:start w:val="1"/>
       <w:numFmt w:val="bullet"/>
       <w:lvlText w:val="○"/>
@@ -14615,7 +15104,7 @@
         <w:ind w:left="1440" w:hanging="360"/>
       </w:pPr>
     </w:lvl>
-    <w:lvl w:ilvl="2" w:tplc="9198DFE6">
+    <w:lvl w:ilvl="2" w:tplc="ADFAED52">
       <w:start w:val="1"/>
       <w:numFmt w:val="bullet"/>
       <w:lvlText w:val="■"/>
@@ -14624,7 +15113,7 @@
         <w:ind w:left="2160" w:hanging="360"/>
       </w:pPr>
     </w:lvl>
-    <w:lvl w:ilvl="3" w:tplc="F6F829FE">
+    <w:lvl w:ilvl="3" w:tplc="09CE656C">
       <w:start w:val="1"/>
       <w:numFmt w:val="bullet"/>
       <w:lvlText w:val="●"/>
@@ -14633,7 +15122,7 @@
         <w:ind w:left="2880" w:hanging="360"/>
       </w:pPr>
     </w:lvl>
-    <w:lvl w:ilvl="4" w:tplc="80248856">
+    <w:lvl w:ilvl="4" w:tplc="79A2DE92">
       <w:start w:val="1"/>
       <w:numFmt w:val="bullet"/>
       <w:lvlText w:val="○"/>
@@ -14642,7 +15131,7 @@
         <w:ind w:left="3600" w:hanging="360"/>
       </w:pPr>
     </w:lvl>
-    <w:lvl w:ilvl="5" w:tplc="AFFE2C5E">
+    <w:lvl w:ilvl="5" w:tplc="3B429D3E">
       <w:start w:val="1"/>
       <w:numFmt w:val="bullet"/>
       <w:lvlText w:val="■"/>
@@ -14651,7 +15140,7 @@
         <w:ind w:left="4320" w:hanging="360"/>
       </w:pPr>
     </w:lvl>
-    <w:lvl w:ilvl="6" w:tplc="9AEE3C66">
+    <w:lvl w:ilvl="6" w:tplc="D996FA34">
       <w:start w:val="1"/>
       <w:numFmt w:val="bullet"/>
       <w:lvlText w:val="●"/>
@@ -14660,7 +15149,7 @@
         <w:ind w:left="5040" w:hanging="360"/>
       </w:pPr>
     </w:lvl>
-    <w:lvl w:ilvl="7" w:tplc="99ACFDFA">
+    <w:lvl w:ilvl="7" w:tplc="4A18FBD2">
       <w:start w:val="1"/>
       <w:numFmt w:val="bullet"/>
       <w:lvlText w:val="●"/>
@@ -14669,7 +15158,7 @@
         <w:ind w:left="5760" w:hanging="360"/>
       </w:pPr>
     </w:lvl>
-    <w:lvl w:ilvl="8" w:tplc="1628640C">
+    <w:lvl w:ilvl="8" w:tplc="6D68B6D0">
       <w:start w:val="1"/>
       <w:numFmt w:val="bullet"/>
       <w:lvlText w:val="●"/>
@@ -14679,11 +15168,11 @@
       </w:pPr>
     </w:lvl>
   </w:abstractNum>
-  <w:abstractNum w:abstractNumId="2" w15:restartNumberingAfterBreak="0">
-    <w:nsid w:val="5C8F1B41"/>
+  <w:abstractNum w:abstractNumId="1" w15:restartNumberingAfterBreak="0">
+    <w:nsid w:val="348D3C68"/>
     <w:multiLevelType w:val="hybridMultilevel"/>
-    <w:tmpl w:val="A3EC40CC"/>
-    <w:lvl w:ilvl="0" w:tplc="5574DEA6">
+    <w:tmpl w:val="1E446386"/>
+    <w:lvl w:ilvl="0" w:tplc="93606FD2">
       <w:start w:val="1"/>
       <w:numFmt w:val="decimal"/>
       <w:lvlText w:val="%1."/>
@@ -14692,61 +15181,115 @@
         <w:ind w:left="620" w:hanging="320"/>
       </w:pPr>
     </w:lvl>
-    <w:lvl w:ilvl="1" w:tplc="1F708BE2">
+    <w:lvl w:ilvl="1" w:tplc="3EE65A6A">
       <w:numFmt w:val="decimal"/>
       <w:lvlText w:val=""/>
       <w:lvlJc w:val="left"/>
     </w:lvl>
-    <w:lvl w:ilvl="2" w:tplc="D4CAE30A">
+    <w:lvl w:ilvl="2" w:tplc="029A0912">
       <w:numFmt w:val="decimal"/>
       <w:lvlText w:val=""/>
       <w:lvlJc w:val="left"/>
     </w:lvl>
-    <w:lvl w:ilvl="3" w:tplc="B454A02C">
+    <w:lvl w:ilvl="3" w:tplc="6A5A5F88">
       <w:numFmt w:val="decimal"/>
       <w:lvlText w:val=""/>
       <w:lvlJc w:val="left"/>
     </w:lvl>
-    <w:lvl w:ilvl="4" w:tplc="691AA8C0">
+    <w:lvl w:ilvl="4" w:tplc="79623DD0">
       <w:numFmt w:val="decimal"/>
       <w:lvlText w:val=""/>
       <w:lvlJc w:val="left"/>
     </w:lvl>
-    <w:lvl w:ilvl="5" w:tplc="6D10685A">
+    <w:lvl w:ilvl="5" w:tplc="C106B414">
       <w:numFmt w:val="decimal"/>
       <w:lvlText w:val=""/>
       <w:lvlJc w:val="left"/>
     </w:lvl>
-    <w:lvl w:ilvl="6" w:tplc="BC221C18">
+    <w:lvl w:ilvl="6" w:tplc="E614320C">
       <w:numFmt w:val="decimal"/>
       <w:lvlText w:val=""/>
       <w:lvlJc w:val="left"/>
     </w:lvl>
-    <w:lvl w:ilvl="7" w:tplc="13945594">
+    <w:lvl w:ilvl="7" w:tplc="7556FDEC">
       <w:numFmt w:val="decimal"/>
       <w:lvlText w:val=""/>
       <w:lvlJc w:val="left"/>
     </w:lvl>
-    <w:lvl w:ilvl="8" w:tplc="706A2BDA">
+    <w:lvl w:ilvl="8" w:tplc="DFAC70FA">
       <w:numFmt w:val="decimal"/>
       <w:lvlText w:val=""/>
       <w:lvlJc w:val="left"/>
     </w:lvl>
   </w:abstractNum>
-  <w:num w:numId="1" w16cid:durableId="2098364398">
-    <w:abstractNumId w:val="1"/>
-    <w:lvlOverride w:ilvl="0">
-      <w:startOverride w:val="1"/>
-    </w:lvlOverride>
-  </w:num>
-  <w:num w:numId="2" w16cid:durableId="1048335180">
+  <w:abstractNum w:abstractNumId="2" w15:restartNumberingAfterBreak="0">
+    <w:nsid w:val="386B2658"/>
+    <w:multiLevelType w:val="hybridMultilevel"/>
+    <w:tmpl w:val="7CDC600A"/>
+    <w:lvl w:ilvl="0" w:tplc="DAD0DFA8">
+      <w:start w:val="1"/>
+      <w:numFmt w:val="bullet"/>
+      <w:lvlText w:val="•"/>
+      <w:lvlJc w:val="left"/>
+      <w:pPr>
+        <w:ind w:left="620" w:hanging="320"/>
+      </w:pPr>
+    </w:lvl>
+    <w:lvl w:ilvl="1" w:tplc="D1BCDA50">
+      <w:numFmt w:val="decimal"/>
+      <w:lvlText w:val=""/>
+      <w:lvlJc w:val="left"/>
+    </w:lvl>
+    <w:lvl w:ilvl="2" w:tplc="A6BAC0E4">
+      <w:numFmt w:val="decimal"/>
+      <w:lvlText w:val=""/>
+      <w:lvlJc w:val="left"/>
+    </w:lvl>
+    <w:lvl w:ilvl="3" w:tplc="9ACE43EE">
+      <w:numFmt w:val="decimal"/>
+      <w:lvlText w:val=""/>
+      <w:lvlJc w:val="left"/>
+    </w:lvl>
+    <w:lvl w:ilvl="4" w:tplc="77EAADD0">
+      <w:numFmt w:val="decimal"/>
+      <w:lvlText w:val=""/>
+      <w:lvlJc w:val="left"/>
+    </w:lvl>
+    <w:lvl w:ilvl="5" w:tplc="AC4C560E">
+      <w:numFmt w:val="decimal"/>
+      <w:lvlText w:val=""/>
+      <w:lvlJc w:val="left"/>
+    </w:lvl>
+    <w:lvl w:ilvl="6" w:tplc="E85C9558">
+      <w:numFmt w:val="decimal"/>
+      <w:lvlText w:val=""/>
+      <w:lvlJc w:val="left"/>
+    </w:lvl>
+    <w:lvl w:ilvl="7" w:tplc="C9F41618">
+      <w:numFmt w:val="decimal"/>
+      <w:lvlText w:val=""/>
+      <w:lvlJc w:val="left"/>
+    </w:lvl>
+    <w:lvl w:ilvl="8" w:tplc="02167506">
+      <w:numFmt w:val="decimal"/>
+      <w:lvlText w:val=""/>
+      <w:lvlJc w:val="left"/>
+    </w:lvl>
+  </w:abstractNum>
+  <w:num w:numId="1" w16cid:durableId="930705149">
     <w:abstractNumId w:val="0"/>
     <w:lvlOverride w:ilvl="0">
       <w:startOverride w:val="1"/>
     </w:lvlOverride>
   </w:num>
-  <w:num w:numId="3" w16cid:durableId="1558470376">
+  <w:num w:numId="2" w16cid:durableId="603734035">
     <w:abstractNumId w:val="2"/>
+    <w:lvlOverride w:ilvl="0">
+      <w:startOverride w:val="1"/>
+    </w:lvlOverride>
+  </w:num>
+  <w:num w:numId="3" w16cid:durableId="455030508">
+    <w:abstractNumId w:val="1"/>
     <w:lvlOverride w:ilvl="0">
       <w:startOverride w:val="1"/>
     </w:lvlOverride>
@@ -15370,7 +15913,7 @@
     <w:autoRedefine/>
     <w:uiPriority w:val="39"/>
     <w:unhideWhenUsed/>
-    <w:rsid w:val="00260A39"/>
+    <w:rsid w:val="00B5764C"/>
     <w:pPr>
       <w:spacing w:after="100"/>
     </w:pPr>
@@ -15382,7 +15925,7 @@
     <w:autoRedefine/>
     <w:uiPriority w:val="39"/>
     <w:unhideWhenUsed/>
-    <w:rsid w:val="00260A39"/>
+    <w:rsid w:val="00B5764C"/>
     <w:pPr>
       <w:spacing w:after="100"/>
       <w:ind w:left="210"/>

</xml_diff>